<commit_message>
Add Bucksbaum-Siegler Associate Junior Faculty Scholar to honors
Lists the 2026 Associate Junior Faculty Scholar appointment (Bucksbaum-Siegler
Institute for Clinical Excellence) at the top of Honors & Awards in the CV
source and on resume.html, then rebuilds the CV docx/PDF. The PDF text diff
against the previous build is this one line; still 6 pages.

The PDF was exported via LibreOffice with Carlito (Calibri-metric-compatible),
not Word, so the embedded font differs from the prior Word build.

Co-Authored-By: Claude Opus 5.5 <noreply@anthropic.com>
Claude-Session: https://claude.ai/code/session_01AVGY4r3fffQQBBRwAwVDAn
</commit_message>
<xml_diff>
--- a/Andrew_Rausch_CV.docx
+++ b/Andrew_Rausch_CV.docx
@@ -315,6 +315,25 @@
           <w:b/>
         </w:rPr>
         <w:t>HONORS &amp; AWARDS</w:t>
+      </w:r>
+    </w:p>
+    <w:p>
+      <w:pPr>
+        <w:tabs>
+          <w:tab w:pos="1656" w:val="left"/>
+        </w:tabs>
+        <w:ind w:left="1656" w:hanging="1656"/>
+      </w:pPr>
+      <w:r>
+        <w:t>2026</w:t>
+        <w:tab/>
+      </w:r>
+      <w:r>
+        <w:rPr>
+          <w:b w:val="0"/>
+          <w:i w:val="0"/>
+        </w:rPr>
+        <w:t>Associate Junior Faculty Scholar, Bucksbaum-Siegler Institute for Clinical Excellence, University of Chicago</w:t>
       </w:r>
     </w:p>
     <w:p>

</xml_diff>

<commit_message>
CV: rebuild in the UChicago BSD/COAP layout
Sync cv/build_cv.py from md-cv (UChicago template structure: CURRICULUM
VITAE title block, labeled contact, numbered citations, page footer) and
mark up the source for it: Address/Dated labels, numbered bibliography
entries, own name underlined. No content changes.

Co-Authored-By: Claude Opus 5.5 <noreply@anthropic.com>
</commit_message>
<xml_diff>
--- a/Andrew_Rausch_CV.docx
+++ b/Andrew_Rausch_CV.docx
@@ -3,15 +3,49 @@
 <w:document xmlns:wpc="http://schemas.microsoft.com/office/word/2010/wordprocessingCanvas" xmlns:mo="http://schemas.microsoft.com/office/mac/office/2008/main" xmlns:mc="http://schemas.openxmlformats.org/markup-compatibility/2006" xmlns:mv="urn:schemas-microsoft-com:mac:vml" xmlns:o="urn:schemas-microsoft-com:office:office" xmlns:r="http://schemas.openxmlformats.org/officeDocument/2006/relationships" xmlns:m="http://schemas.openxmlformats.org/officeDocument/2006/math" xmlns:v="urn:schemas-microsoft-com:vml" xmlns:wp14="http://schemas.microsoft.com/office/word/2010/wordprocessingDrawing" xmlns:wp="http://schemas.openxmlformats.org/drawingml/2006/wordprocessingDrawing" xmlns:w10="urn:schemas-microsoft-com:office:word" xmlns:w="http://schemas.openxmlformats.org/wordprocessingml/2006/main" xmlns:w14="http://schemas.microsoft.com/office/word/2010/wordml" xmlns:wpg="http://schemas.microsoft.com/office/word/2010/wordprocessingGroup" xmlns:wpi="http://schemas.microsoft.com/office/word/2010/wordprocessingInk" xmlns:wne="http://schemas.microsoft.com/office/word/2006/wordml" xmlns:wps="http://schemas.microsoft.com/office/word/2010/wordprocessingShape" mc:Ignorable="w14 wp14">
   <w:body>
     <w:p>
+      <w:pPr>
+        <w:jc w:val="center"/>
+      </w:pPr>
       <w:r>
         <w:rPr>
           <w:b/>
-          <w:sz w:val="32"/>
+          <w:sz w:val="22"/>
+        </w:rPr>
+        <w:t>CURRICULUM VITAE</w:t>
+      </w:r>
+    </w:p>
+    <w:p>
+      <w:pPr>
+        <w:jc w:val="center"/>
+      </w:pPr>
+      <w:r>
+        <w:rPr>
+          <w:b/>
+          <w:sz w:val="22"/>
         </w:rPr>
         <w:t>Andrew C Rausch, MD</w:t>
       </w:r>
     </w:p>
     <w:p>
+      <w:pPr>
+        <w:jc w:val="right"/>
+      </w:pPr>
+      <w:r>
+        <w:t>Chicago, 10/8/26</w:t>
+      </w:r>
+    </w:p>
+    <w:p/>
+    <w:p>
+      <w:pPr>
+        <w:tabs>
+          <w:tab w:pos="1440" w:val="left"/>
+        </w:tabs>
+        <w:ind w:left="1440" w:hanging="1440"/>
+      </w:pPr>
+      <w:r>
+        <w:t>Address:</w:t>
+        <w:tab/>
+      </w:r>
       <w:r>
         <w:rPr>
           <w:b w:val="0"/>
@@ -21,6 +55,9 @@
       </w:r>
     </w:p>
     <w:p>
+      <w:pPr>
+        <w:ind w:left="1440"/>
+      </w:pPr>
       <w:r>
         <w:rPr>
           <w:b w:val="0"/>
@@ -30,6 +67,9 @@
       </w:r>
     </w:p>
     <w:p>
+      <w:pPr>
+        <w:ind w:left="1440"/>
+      </w:pPr>
       <w:r>
         <w:rPr>
           <w:b w:val="0"/>
@@ -39,6 +79,9 @@
       </w:r>
     </w:p>
     <w:p>
+      <w:pPr>
+        <w:ind w:left="1440"/>
+      </w:pPr>
       <w:r>
         <w:rPr>
           <w:b w:val="0"/>
@@ -48,6 +91,9 @@
       </w:r>
     </w:p>
     <w:p>
+      <w:pPr>
+        <w:ind w:left="1440"/>
+      </w:pPr>
       <w:r>
         <w:rPr>
           <w:b w:val="0"/>
@@ -57,35 +103,66 @@
       </w:r>
     </w:p>
     <w:p>
+      <w:pPr>
+        <w:tabs>
+          <w:tab w:pos="1440" w:val="left"/>
+        </w:tabs>
+        <w:ind w:left="1440" w:hanging="1440"/>
+      </w:pPr>
+      <w:r>
+        <w:t>Office:</w:t>
+        <w:tab/>
+      </w:r>
       <w:r>
         <w:rPr>
           <w:b w:val="0"/>
           <w:i w:val="0"/>
         </w:rPr>
-        <w:t>Office: 773-702-6621</w:t>
+        <w:t>773-702-6621</w:t>
       </w:r>
     </w:p>
     <w:p>
+      <w:pPr>
+        <w:tabs>
+          <w:tab w:pos="1440" w:val="left"/>
+        </w:tabs>
+        <w:ind w:left="1440" w:hanging="1440"/>
+      </w:pPr>
+      <w:r>
+        <w:t>Cell:</w:t>
+        <w:tab/>
+      </w:r>
       <w:r>
         <w:rPr>
           <w:b w:val="0"/>
           <w:i w:val="0"/>
         </w:rPr>
-        <w:t>Cell: 612-309-4222</w:t>
+        <w:t>612-309-4222</w:t>
       </w:r>
     </w:p>
     <w:p>
+      <w:pPr>
+        <w:tabs>
+          <w:tab w:pos="1440" w:val="left"/>
+        </w:tabs>
+        <w:ind w:left="1440" w:hanging="1440"/>
+      </w:pPr>
+      <w:r>
+        <w:t>Email:</w:t>
+        <w:tab/>
+      </w:r>
       <w:r>
         <w:rPr>
           <w:b w:val="0"/>
           <w:i w:val="0"/>
         </w:rPr>
-        <w:t>Email: ARausch@bsd.uchicago.edu</w:t>
+        <w:t>ARausch@bsd.uchicago.edu</w:t>
       </w:r>
     </w:p>
     <w:p>
       <w:pPr>
-        <w:spacing w:before="240" w:after="80"/>
+        <w:keepNext/>
+        <w:spacing w:before="240" w:after="0"/>
       </w:pPr>
       <w:r>
         <w:rPr>
@@ -97,9 +174,9 @@
     <w:p>
       <w:pPr>
         <w:tabs>
-          <w:tab w:pos="1656" w:val="left"/>
+          <w:tab w:pos="1440" w:val="left"/>
         </w:tabs>
-        <w:ind w:left="1656" w:hanging="1656"/>
+        <w:ind w:left="1440" w:hanging="1440"/>
       </w:pPr>
       <w:r>
         <w:t>2018–2021</w:t>
@@ -116,9 +193,9 @@
     <w:p>
       <w:pPr>
         <w:tabs>
-          <w:tab w:pos="1656" w:val="left"/>
+          <w:tab w:pos="1440" w:val="left"/>
         </w:tabs>
-        <w:ind w:left="1656" w:hanging="1656"/>
+        <w:ind w:left="1440" w:hanging="1440"/>
       </w:pPr>
       <w:r>
         <w:t>2021–present</w:t>
@@ -134,7 +211,8 @@
     </w:p>
     <w:p>
       <w:pPr>
-        <w:spacing w:before="240" w:after="80"/>
+        <w:keepNext/>
+        <w:spacing w:before="240" w:after="0"/>
       </w:pPr>
       <w:r>
         <w:rPr>
@@ -146,9 +224,9 @@
     <w:p>
       <w:pPr>
         <w:tabs>
-          <w:tab w:pos="1656" w:val="left"/>
+          <w:tab w:pos="1440" w:val="left"/>
         </w:tabs>
-        <w:ind w:left="1656" w:hanging="1656"/>
+        <w:ind w:left="1440" w:hanging="1440"/>
       </w:pPr>
       <w:r>
         <w:t>2004–2008</w:t>
@@ -165,9 +243,9 @@
     <w:p>
       <w:pPr>
         <w:tabs>
-          <w:tab w:pos="1656" w:val="left"/>
+          <w:tab w:pos="1440" w:val="left"/>
         </w:tabs>
-        <w:ind w:left="1656" w:hanging="1656"/>
+        <w:ind w:left="1440" w:hanging="1440"/>
       </w:pPr>
       <w:r>
         <w:t>2010–2014</w:t>
@@ -184,9 +262,9 @@
     <w:p>
       <w:pPr>
         <w:tabs>
-          <w:tab w:pos="1656" w:val="left"/>
+          <w:tab w:pos="1440" w:val="left"/>
         </w:tabs>
-        <w:ind w:left="1656" w:hanging="1656"/>
+        <w:ind w:left="1440" w:hanging="1440"/>
       </w:pPr>
       <w:r>
         <w:t>2014–2018</w:t>
@@ -203,9 +281,9 @@
     <w:p>
       <w:pPr>
         <w:tabs>
-          <w:tab w:pos="1656" w:val="left"/>
+          <w:tab w:pos="1440" w:val="left"/>
         </w:tabs>
-        <w:ind w:left="1656" w:hanging="1656"/>
+        <w:ind w:left="1440" w:hanging="1440"/>
       </w:pPr>
       <w:r>
         <w:t>2018–2021</w:t>
@@ -221,7 +299,8 @@
     </w:p>
     <w:p>
       <w:pPr>
-        <w:spacing w:before="240" w:after="80"/>
+        <w:keepNext/>
+        <w:spacing w:before="240" w:after="0"/>
       </w:pPr>
       <w:r>
         <w:rPr>
@@ -233,9 +312,9 @@
     <w:p>
       <w:pPr>
         <w:tabs>
-          <w:tab w:pos="1656" w:val="left"/>
+          <w:tab w:pos="1440" w:val="left"/>
         </w:tabs>
-        <w:ind w:left="1656" w:hanging="1656"/>
+        <w:ind w:left="1440" w:hanging="1440"/>
       </w:pPr>
       <w:r>
         <w:t>2018–2022</w:t>
@@ -252,9 +331,9 @@
     <w:p>
       <w:pPr>
         <w:tabs>
-          <w:tab w:pos="1656" w:val="left"/>
+          <w:tab w:pos="1440" w:val="left"/>
         </w:tabs>
-        <w:ind w:left="1656" w:hanging="1656"/>
+        <w:ind w:left="1440" w:hanging="1440"/>
       </w:pPr>
       <w:r>
         <w:t>2021–present</w:t>
@@ -271,9 +350,9 @@
     <w:p>
       <w:pPr>
         <w:tabs>
-          <w:tab w:pos="1656" w:val="left"/>
+          <w:tab w:pos="1440" w:val="left"/>
         </w:tabs>
-        <w:ind w:left="1656" w:hanging="1656"/>
+        <w:ind w:left="1440" w:hanging="1440"/>
       </w:pPr>
       <w:r>
         <w:t>2021–present</w:t>
@@ -290,9 +369,9 @@
     <w:p>
       <w:pPr>
         <w:tabs>
-          <w:tab w:pos="1656" w:val="left"/>
+          <w:tab w:pos="1440" w:val="left"/>
         </w:tabs>
-        <w:ind w:left="1656" w:hanging="1656"/>
+        <w:ind w:left="1440" w:hanging="1440"/>
       </w:pPr>
       <w:r>
         <w:t>2026–present</w:t>
@@ -308,7 +387,8 @@
     </w:p>
     <w:p>
       <w:pPr>
-        <w:spacing w:before="240" w:after="80"/>
+        <w:keepNext/>
+        <w:spacing w:before="240" w:after="0"/>
       </w:pPr>
       <w:r>
         <w:rPr>
@@ -320,9 +400,9 @@
     <w:p>
       <w:pPr>
         <w:tabs>
-          <w:tab w:pos="1656" w:val="left"/>
+          <w:tab w:pos="1440" w:val="left"/>
         </w:tabs>
-        <w:ind w:left="1656" w:hanging="1656"/>
+        <w:ind w:left="1440" w:hanging="1440"/>
       </w:pPr>
       <w:r>
         <w:t>2026</w:t>
@@ -339,9 +419,9 @@
     <w:p>
       <w:pPr>
         <w:tabs>
-          <w:tab w:pos="1656" w:val="left"/>
+          <w:tab w:pos="1440" w:val="left"/>
         </w:tabs>
-        <w:ind w:left="1656" w:hanging="1656"/>
+        <w:ind w:left="1440" w:hanging="1440"/>
       </w:pPr>
       <w:r>
         <w:t>2024</w:t>
@@ -358,9 +438,9 @@
     <w:p>
       <w:pPr>
         <w:tabs>
-          <w:tab w:pos="1656" w:val="left"/>
+          <w:tab w:pos="1440" w:val="left"/>
         </w:tabs>
-        <w:ind w:left="1656" w:hanging="1656"/>
+        <w:ind w:left="1440" w:hanging="1440"/>
       </w:pPr>
       <w:r>
         <w:t>2020</w:t>
@@ -377,9 +457,9 @@
     <w:p>
       <w:pPr>
         <w:tabs>
-          <w:tab w:pos="1656" w:val="left"/>
+          <w:tab w:pos="1440" w:val="left"/>
         </w:tabs>
-        <w:ind w:left="1656" w:hanging="1656"/>
+        <w:ind w:left="1440" w:hanging="1440"/>
       </w:pPr>
       <w:r>
         <w:t>2016</w:t>
@@ -396,9 +476,9 @@
     <w:p>
       <w:pPr>
         <w:tabs>
-          <w:tab w:pos="1656" w:val="left"/>
+          <w:tab w:pos="1440" w:val="left"/>
         </w:tabs>
-        <w:ind w:left="1656" w:hanging="1656"/>
+        <w:ind w:left="1440" w:hanging="1440"/>
       </w:pPr>
       <w:r>
         <w:t>2015, 2016</w:t>
@@ -415,9 +495,9 @@
     <w:p>
       <w:pPr>
         <w:tabs>
-          <w:tab w:pos="1656" w:val="left"/>
+          <w:tab w:pos="1440" w:val="left"/>
         </w:tabs>
-        <w:ind w:left="1656" w:hanging="1656"/>
+        <w:ind w:left="1440" w:hanging="1440"/>
       </w:pPr>
       <w:r>
         <w:t>2011</w:t>
@@ -434,9 +514,9 @@
     <w:p>
       <w:pPr>
         <w:tabs>
-          <w:tab w:pos="1656" w:val="left"/>
+          <w:tab w:pos="1440" w:val="left"/>
         </w:tabs>
-        <w:ind w:left="1656" w:hanging="1656"/>
+        <w:ind w:left="1440" w:hanging="1440"/>
       </w:pPr>
       <w:r>
         <w:t>2008</w:t>
@@ -467,9 +547,9 @@
     <w:p>
       <w:pPr>
         <w:tabs>
-          <w:tab w:pos="1656" w:val="left"/>
+          <w:tab w:pos="1440" w:val="left"/>
         </w:tabs>
-        <w:ind w:left="1656" w:hanging="1656"/>
+        <w:ind w:left="1440" w:hanging="1440"/>
       </w:pPr>
       <w:r>
         <w:t>2007</w:t>
@@ -486,9 +566,9 @@
     <w:p>
       <w:pPr>
         <w:tabs>
-          <w:tab w:pos="1656" w:val="left"/>
+          <w:tab w:pos="1440" w:val="left"/>
         </w:tabs>
-        <w:ind w:left="1656" w:hanging="1656"/>
+        <w:ind w:left="1440" w:hanging="1440"/>
       </w:pPr>
       <w:r>
         <w:t>2004</w:t>
@@ -505,9 +585,9 @@
     <w:p>
       <w:pPr>
         <w:tabs>
-          <w:tab w:pos="1656" w:val="left"/>
+          <w:tab w:pos="1440" w:val="left"/>
         </w:tabs>
-        <w:ind w:left="1656" w:hanging="1656"/>
+        <w:ind w:left="1440" w:hanging="1440"/>
       </w:pPr>
       <w:r>
         <w:t>2004</w:t>
@@ -523,7 +603,8 @@
     </w:p>
     <w:p>
       <w:pPr>
-        <w:spacing w:before="240" w:after="80"/>
+        <w:keepNext/>
+        <w:spacing w:before="240" w:after="0"/>
       </w:pPr>
       <w:r>
         <w:rPr>
@@ -535,9 +616,9 @@
     <w:p>
       <w:pPr>
         <w:tabs>
-          <w:tab w:pos="1656" w:val="left"/>
+          <w:tab w:pos="1440" w:val="left"/>
         </w:tabs>
-        <w:ind w:left="1656" w:hanging="1656"/>
+        <w:ind w:left="1440" w:hanging="1440"/>
       </w:pPr>
       <w:r>
         <w:t>2020</w:t>
@@ -554,9 +635,9 @@
     <w:p>
       <w:pPr>
         <w:tabs>
-          <w:tab w:pos="1656" w:val="left"/>
+          <w:tab w:pos="1440" w:val="left"/>
         </w:tabs>
-        <w:ind w:left="1656" w:hanging="1656"/>
+        <w:ind w:left="1440" w:hanging="1440"/>
       </w:pPr>
       <w:r>
         <w:t>2021</w:t>
@@ -573,9 +654,9 @@
     <w:p>
       <w:pPr>
         <w:tabs>
-          <w:tab w:pos="1656" w:val="left"/>
+          <w:tab w:pos="1440" w:val="left"/>
         </w:tabs>
-        <w:ind w:left="1656" w:hanging="1656"/>
+        <w:ind w:left="1440" w:hanging="1440"/>
       </w:pPr>
       <w:r>
         <w:t>2023</w:t>
@@ -592,9 +673,9 @@
     <w:p>
       <w:pPr>
         <w:tabs>
-          <w:tab w:pos="1656" w:val="left"/>
+          <w:tab w:pos="1440" w:val="left"/>
         </w:tabs>
-        <w:ind w:left="1656" w:hanging="1656"/>
+        <w:ind w:left="1440" w:hanging="1440"/>
       </w:pPr>
       <w:r>
         <w:t>2024</w:t>
@@ -611,9 +692,9 @@
     <w:p>
       <w:pPr>
         <w:tabs>
-          <w:tab w:pos="1656" w:val="left"/>
+          <w:tab w:pos="1440" w:val="left"/>
         </w:tabs>
-        <w:ind w:left="1656" w:hanging="1656"/>
+        <w:ind w:left="1440" w:hanging="1440"/>
       </w:pPr>
       <w:r>
         <w:t>2025</w:t>
@@ -630,9 +711,9 @@
     <w:p>
       <w:pPr>
         <w:tabs>
-          <w:tab w:pos="1656" w:val="left"/>
+          <w:tab w:pos="1440" w:val="left"/>
         </w:tabs>
-        <w:ind w:left="1656" w:hanging="1656"/>
+        <w:ind w:left="1440" w:hanging="1440"/>
       </w:pPr>
       <w:r>
         <w:t>2026</w:t>
@@ -649,9 +730,9 @@
     <w:p>
       <w:pPr>
         <w:tabs>
-          <w:tab w:pos="1656" w:val="left"/>
+          <w:tab w:pos="1440" w:val="left"/>
         </w:tabs>
-        <w:ind w:left="1656" w:hanging="1656"/>
+        <w:ind w:left="1440" w:hanging="1440"/>
       </w:pPr>
       <w:r>
         <w:t>2026</w:t>
@@ -668,9 +749,9 @@
     <w:p>
       <w:pPr>
         <w:tabs>
-          <w:tab w:pos="1656" w:val="left"/>
+          <w:tab w:pos="1440" w:val="left"/>
         </w:tabs>
-        <w:ind w:left="1656" w:hanging="1656"/>
+        <w:ind w:left="1440" w:hanging="1440"/>
       </w:pPr>
       <w:r>
         <w:t>2026</w:t>
@@ -686,7 +767,8 @@
     </w:p>
     <w:p>
       <w:pPr>
-        <w:spacing w:before="240" w:after="80"/>
+        <w:keepNext/>
+        <w:spacing w:before="240" w:after="0"/>
       </w:pPr>
       <w:r>
         <w:rPr>
@@ -706,7 +788,7 @@
     </w:p>
     <w:p>
       <w:pPr>
-        <w:ind w:left="1656"/>
+        <w:ind w:left="1440"/>
       </w:pPr>
       <w:r>
         <w:rPr>
@@ -718,8 +800,8 @@
     </w:p>
     <w:p>
       <w:pPr>
-        <w:spacing w:after="160"/>
-        <w:ind w:left="1656"/>
+        <w:spacing w:after="220"/>
+        <w:ind w:left="1440"/>
       </w:pPr>
       <w:r>
         <w:rPr>
@@ -740,7 +822,7 @@
     </w:p>
     <w:p>
       <w:pPr>
-        <w:ind w:left="1656"/>
+        <w:ind w:left="1440"/>
       </w:pPr>
       <w:r>
         <w:rPr>
@@ -752,8 +834,8 @@
     </w:p>
     <w:p>
       <w:pPr>
-        <w:spacing w:after="160"/>
-        <w:ind w:left="1656"/>
+        <w:spacing w:after="220"/>
+        <w:ind w:left="1440"/>
       </w:pPr>
       <w:r>
         <w:rPr>
@@ -774,7 +856,7 @@
     </w:p>
     <w:p>
       <w:pPr>
-        <w:ind w:left="1656"/>
+        <w:ind w:left="1440"/>
       </w:pPr>
       <w:r>
         <w:rPr>
@@ -786,7 +868,8 @@
     </w:p>
     <w:p>
       <w:pPr>
-        <w:spacing w:before="240" w:after="80"/>
+        <w:keepNext/>
+        <w:spacing w:before="240" w:after="0"/>
       </w:pPr>
       <w:r>
         <w:rPr>
@@ -798,9 +881,9 @@
     <w:p>
       <w:pPr>
         <w:tabs>
-          <w:tab w:pos="1656" w:val="left"/>
+          <w:tab w:pos="1440" w:val="left"/>
         </w:tabs>
-        <w:ind w:left="1656" w:hanging="1656"/>
+        <w:ind w:left="1440" w:hanging="1440"/>
       </w:pPr>
       <w:r>
         <w:t>2026–present</w:t>
@@ -817,9 +900,9 @@
     <w:p>
       <w:pPr>
         <w:tabs>
-          <w:tab w:pos="1656" w:val="left"/>
+          <w:tab w:pos="1440" w:val="left"/>
         </w:tabs>
-        <w:ind w:left="1656" w:hanging="1656"/>
+        <w:ind w:left="1440" w:hanging="1440"/>
       </w:pPr>
       <w:r>
         <w:t>2026–present</w:t>
@@ -836,9 +919,9 @@
     <w:p>
       <w:pPr>
         <w:tabs>
-          <w:tab w:pos="1656" w:val="left"/>
+          <w:tab w:pos="1440" w:val="left"/>
         </w:tabs>
-        <w:ind w:left="1656" w:hanging="1656"/>
+        <w:ind w:left="1440" w:hanging="1440"/>
       </w:pPr>
       <w:r>
         <w:t>2025–present</w:t>
@@ -855,9 +938,9 @@
     <w:p>
       <w:pPr>
         <w:tabs>
-          <w:tab w:pos="1656" w:val="left"/>
+          <w:tab w:pos="1440" w:val="left"/>
         </w:tabs>
-        <w:ind w:left="1656" w:hanging="1656"/>
+        <w:ind w:left="1440" w:hanging="1440"/>
       </w:pPr>
       <w:r>
         <w:t>2024–present</w:t>
@@ -874,9 +957,9 @@
     <w:p>
       <w:pPr>
         <w:tabs>
-          <w:tab w:pos="1656" w:val="left"/>
+          <w:tab w:pos="1440" w:val="left"/>
         </w:tabs>
-        <w:ind w:left="1656" w:hanging="1656"/>
+        <w:ind w:left="1440" w:hanging="1440"/>
       </w:pPr>
       <w:r>
         <w:t>2022–present</w:t>
@@ -893,9 +976,9 @@
     <w:p>
       <w:pPr>
         <w:tabs>
-          <w:tab w:pos="1656" w:val="left"/>
+          <w:tab w:pos="1440" w:val="left"/>
         </w:tabs>
-        <w:ind w:left="1656" w:hanging="1656"/>
+        <w:ind w:left="1440" w:hanging="1440"/>
       </w:pPr>
       <w:r>
         <w:t>2026–present</w:t>
@@ -912,9 +995,9 @@
     <w:p>
       <w:pPr>
         <w:tabs>
-          <w:tab w:pos="1656" w:val="left"/>
+          <w:tab w:pos="1440" w:val="left"/>
         </w:tabs>
-        <w:ind w:left="1656" w:hanging="1656"/>
+        <w:ind w:left="1440" w:hanging="1440"/>
       </w:pPr>
       <w:r>
         <w:t>2022–2026</w:t>
@@ -931,9 +1014,9 @@
     <w:p>
       <w:pPr>
         <w:tabs>
-          <w:tab w:pos="1656" w:val="left"/>
+          <w:tab w:pos="1440" w:val="left"/>
         </w:tabs>
-        <w:ind w:left="1656" w:hanging="1656"/>
+        <w:ind w:left="1440" w:hanging="1440"/>
       </w:pPr>
       <w:r>
         <w:t>2022–present</w:t>
@@ -950,9 +1033,9 @@
     <w:p>
       <w:pPr>
         <w:tabs>
-          <w:tab w:pos="1656" w:val="left"/>
+          <w:tab w:pos="1440" w:val="left"/>
         </w:tabs>
-        <w:ind w:left="1656" w:hanging="1656"/>
+        <w:ind w:left="1440" w:hanging="1440"/>
       </w:pPr>
       <w:r>
         <w:t>2021–present</w:t>
@@ -969,9 +1052,9 @@
     <w:p>
       <w:pPr>
         <w:tabs>
-          <w:tab w:pos="1656" w:val="left"/>
+          <w:tab w:pos="1440" w:val="left"/>
         </w:tabs>
-        <w:ind w:left="1656" w:hanging="1656"/>
+        <w:ind w:left="1440" w:hanging="1440"/>
       </w:pPr>
       <w:r>
         <w:t>2021–present</w:t>
@@ -988,9 +1071,9 @@
     <w:p>
       <w:pPr>
         <w:tabs>
-          <w:tab w:pos="1656" w:val="left"/>
+          <w:tab w:pos="1440" w:val="left"/>
         </w:tabs>
-        <w:ind w:left="1656" w:hanging="1656"/>
+        <w:ind w:left="1440" w:hanging="1440"/>
       </w:pPr>
       <w:r>
         <w:t>2021–present</w:t>
@@ -1007,9 +1090,9 @@
     <w:p>
       <w:pPr>
         <w:tabs>
-          <w:tab w:pos="1656" w:val="left"/>
+          <w:tab w:pos="1440" w:val="left"/>
         </w:tabs>
-        <w:ind w:left="1656" w:hanging="1656"/>
+        <w:ind w:left="1440" w:hanging="1440"/>
       </w:pPr>
       <w:r>
         <w:t>2021–present</w:t>
@@ -1026,9 +1109,9 @@
     <w:p>
       <w:pPr>
         <w:tabs>
-          <w:tab w:pos="1656" w:val="left"/>
+          <w:tab w:pos="1440" w:val="left"/>
         </w:tabs>
-        <w:ind w:left="1656" w:hanging="1656"/>
+        <w:ind w:left="1440" w:hanging="1440"/>
       </w:pPr>
       <w:r>
         <w:t>2021–present</w:t>
@@ -1045,9 +1128,9 @@
     <w:p>
       <w:pPr>
         <w:tabs>
-          <w:tab w:pos="1656" w:val="left"/>
+          <w:tab w:pos="1440" w:val="left"/>
         </w:tabs>
-        <w:ind w:left="1656" w:hanging="1656"/>
+        <w:ind w:left="1440" w:hanging="1440"/>
       </w:pPr>
       <w:r>
         <w:t>2021–present</w:t>
@@ -1064,9 +1147,9 @@
     <w:p>
       <w:pPr>
         <w:tabs>
-          <w:tab w:pos="1656" w:val="left"/>
+          <w:tab w:pos="1440" w:val="left"/>
         </w:tabs>
-        <w:ind w:left="1656" w:hanging="1656"/>
+        <w:ind w:left="1440" w:hanging="1440"/>
       </w:pPr>
       <w:r>
         <w:t>2019–2021</w:t>
@@ -1082,7 +1165,8 @@
     </w:p>
     <w:p>
       <w:pPr>
-        <w:spacing w:before="240" w:after="80"/>
+        <w:keepNext/>
+        <w:spacing w:before="240" w:after="0"/>
       </w:pPr>
       <w:r>
         <w:rPr>
@@ -1094,9 +1178,9 @@
     <w:p>
       <w:pPr>
         <w:tabs>
-          <w:tab w:pos="1656" w:val="left"/>
+          <w:tab w:pos="1440" w:val="left"/>
         </w:tabs>
-        <w:ind w:left="1656" w:hanging="1656"/>
+        <w:ind w:left="1440" w:hanging="1440"/>
       </w:pPr>
       <w:r>
         <w:t>2026–present</w:t>
@@ -1121,7 +1205,7 @@
     </w:p>
     <w:p>
       <w:pPr>
-        <w:ind w:left="1656"/>
+        <w:ind w:left="1440"/>
       </w:pPr>
       <w:r>
         <w:rPr>
@@ -1133,7 +1217,7 @@
     </w:p>
     <w:p>
       <w:pPr>
-        <w:ind w:left="1656"/>
+        <w:ind w:left="1440"/>
       </w:pPr>
       <w:r>
         <w:rPr>
@@ -1145,7 +1229,7 @@
     </w:p>
     <w:p>
       <w:pPr>
-        <w:ind w:left="1656"/>
+        <w:ind w:left="1440"/>
       </w:pPr>
       <w:r>
         <w:rPr>
@@ -1157,7 +1241,8 @@
     </w:p>
     <w:p>
       <w:pPr>
-        <w:spacing w:before="240" w:after="80"/>
+        <w:keepNext/>
+        <w:spacing w:before="240" w:after="0"/>
       </w:pPr>
       <w:r>
         <w:rPr>
@@ -1169,9 +1254,9 @@
     <w:p>
       <w:pPr>
         <w:tabs>
-          <w:tab w:pos="1656" w:val="left"/>
+          <w:tab w:pos="1440" w:val="left"/>
         </w:tabs>
-        <w:ind w:left="1656" w:hanging="1656"/>
+        <w:ind w:left="1440" w:hanging="1440"/>
       </w:pPr>
       <w:r>
         <w:t>Current</w:t>
@@ -1188,9 +1273,9 @@
     <w:p>
       <w:pPr>
         <w:tabs>
-          <w:tab w:pos="1656" w:val="left"/>
+          <w:tab w:pos="1440" w:val="left"/>
         </w:tabs>
-        <w:ind w:left="1656" w:hanging="1656"/>
+        <w:ind w:left="1440" w:hanging="1440"/>
       </w:pPr>
       <w:r>
         <w:t>Current</w:t>
@@ -1207,9 +1292,9 @@
     <w:p>
       <w:pPr>
         <w:tabs>
-          <w:tab w:pos="1656" w:val="left"/>
+          <w:tab w:pos="1440" w:val="left"/>
         </w:tabs>
-        <w:ind w:left="1656" w:hanging="1656"/>
+        <w:ind w:left="1440" w:hanging="1440"/>
       </w:pPr>
       <w:r>
         <w:t>Current</w:t>
@@ -1226,9 +1311,9 @@
     <w:p>
       <w:pPr>
         <w:tabs>
-          <w:tab w:pos="1656" w:val="left"/>
+          <w:tab w:pos="1440" w:val="left"/>
         </w:tabs>
-        <w:ind w:left="1656" w:hanging="1656"/>
+        <w:ind w:left="1440" w:hanging="1440"/>
       </w:pPr>
       <w:r>
         <w:t>Current</w:t>
@@ -1245,9 +1330,9 @@
     <w:p>
       <w:pPr>
         <w:tabs>
-          <w:tab w:pos="1656" w:val="left"/>
+          <w:tab w:pos="1440" w:val="left"/>
         </w:tabs>
-        <w:ind w:left="1656" w:hanging="1656"/>
+        <w:ind w:left="1440" w:hanging="1440"/>
       </w:pPr>
       <w:r>
         <w:t>Current</w:t>
@@ -1264,9 +1349,9 @@
     <w:p>
       <w:pPr>
         <w:tabs>
-          <w:tab w:pos="1656" w:val="left"/>
+          <w:tab w:pos="1440" w:val="left"/>
         </w:tabs>
-        <w:ind w:left="1656" w:hanging="1656"/>
+        <w:ind w:left="1440" w:hanging="1440"/>
       </w:pPr>
       <w:r>
         <w:t>Current</w:t>
@@ -1283,9 +1368,9 @@
     <w:p>
       <w:pPr>
         <w:tabs>
-          <w:tab w:pos="1656" w:val="left"/>
+          <w:tab w:pos="1440" w:val="left"/>
         </w:tabs>
-        <w:ind w:left="1656" w:hanging="1656"/>
+        <w:ind w:left="1440" w:hanging="1440"/>
       </w:pPr>
       <w:r>
         <w:t>Current</w:t>
@@ -1302,9 +1387,9 @@
     <w:p>
       <w:pPr>
         <w:tabs>
-          <w:tab w:pos="1656" w:val="left"/>
+          <w:tab w:pos="1440" w:val="left"/>
         </w:tabs>
-        <w:ind w:left="1656" w:hanging="1656"/>
+        <w:ind w:left="1440" w:hanging="1440"/>
       </w:pPr>
       <w:r>
         <w:t>Current</w:t>
@@ -1321,9 +1406,9 @@
     <w:p>
       <w:pPr>
         <w:tabs>
-          <w:tab w:pos="1656" w:val="left"/>
+          <w:tab w:pos="1440" w:val="left"/>
         </w:tabs>
-        <w:ind w:left="1656" w:hanging="1656"/>
+        <w:ind w:left="1440" w:hanging="1440"/>
       </w:pPr>
       <w:r>
         <w:t>2023</w:t>
@@ -1339,7 +1424,8 @@
     </w:p>
     <w:p>
       <w:pPr>
-        <w:spacing w:before="240" w:after="80"/>
+        <w:keepNext/>
+        <w:spacing w:before="240" w:after="0"/>
       </w:pPr>
       <w:r>
         <w:rPr>
@@ -1377,42 +1463,77 @@
     </w:p>
     <w:p>
       <w:pPr>
-        <w:spacing w:before="240" w:after="80"/>
+        <w:keepNext/>
+        <w:spacing w:before="240" w:after="0"/>
       </w:pPr>
       <w:r>
         <w:rPr>
           <w:b/>
         </w:rPr>
-        <w:t>Bibliography</w:t>
+        <w:t>BIBLIOGRAPHY</w:t>
       </w:r>
     </w:p>
     <w:p>
       <w:pPr>
-        <w:spacing w:before="120"/>
+        <w:keepNext/>
+        <w:spacing w:before="160"/>
       </w:pPr>
       <w:r>
         <w:rPr>
-          <w:b/>
+          <w:b w:val="0"/>
+          <w:i/>
+          <w:u w:val="single"/>
         </w:rPr>
         <w:t>(a) Peer-reviewed Publications</w:t>
       </w:r>
     </w:p>
     <w:p>
       <w:pPr>
-        <w:spacing w:after="160"/>
+        <w:tabs>
+          <w:tab w:pos="450" w:val="left"/>
+        </w:tabs>
+        <w:spacing w:after="220"/>
+        <w:ind w:left="450" w:hanging="360"/>
       </w:pPr>
+      <w:r>
+        <w:t>1.</w:t>
+        <w:tab/>
+      </w:r>
       <w:r>
         <w:rPr>
           <w:b w:val="0"/>
           <w:i w:val="0"/>
         </w:rPr>
-        <w:t>Burns LP, Wright G, Rausch AC, Premkumar A. “Unintentional Extensions of the Cesarean Hysterotomy Incision: A Review and Proposed Classification System,” Obstetrics &amp; Gynecology: 1–11. 2026</w:t>
+        <w:t xml:space="preserve">Burns LP, Wright G, </w:t>
+      </w:r>
+      <w:r>
+        <w:rPr>
+          <w:b w:val="0"/>
+          <w:i w:val="0"/>
+          <w:u w:val="single"/>
+        </w:rPr>
+        <w:t>Rausch AC</w:t>
+      </w:r>
+      <w:r>
+        <w:rPr>
+          <w:b w:val="0"/>
+          <w:i w:val="0"/>
+        </w:rPr>
+        <w:t>, Premkumar A. “Unintentional Extensions of the Cesarean Hysterotomy Incision: A Review and Proposed Classification System,” Obstetrics &amp; Gynecology: 1–11. 2026</w:t>
       </w:r>
     </w:p>
     <w:p>
       <w:pPr>
-        <w:spacing w:after="160"/>
+        <w:tabs>
+          <w:tab w:pos="450" w:val="left"/>
+        </w:tabs>
+        <w:spacing w:after="220"/>
+        <w:ind w:left="450" w:hanging="360"/>
       </w:pPr>
+      <w:r>
+        <w:t>2.</w:t>
+        <w:tab/>
+      </w:r>
       <w:r>
         <w:rPr>
           <w:b w:val="0"/>
@@ -1423,140 +1544,398 @@
     </w:p>
     <w:p>
       <w:pPr>
-        <w:spacing w:after="160"/>
+        <w:tabs>
+          <w:tab w:pos="450" w:val="left"/>
+        </w:tabs>
+        <w:spacing w:after="220"/>
+        <w:ind w:left="450" w:hanging="360"/>
       </w:pPr>
+      <w:r>
+        <w:t>3.</w:t>
+        <w:tab/>
+      </w:r>
       <w:r>
         <w:rPr>
           <w:b w:val="0"/>
           <w:i w:val="0"/>
         </w:rPr>
-        <w:t>Ploran EJ, Comfort L, Rausch A, Snellings JT, &amp; Rochelson B. Perceptual distortions during simultaneous continuous monitoring of fetal and maternal heart rate in laboring patients. The Journal of Maternal-Fetal &amp; Neonatal Medicine, 2026</w:t>
+        <w:t xml:space="preserve">Ploran EJ, Comfort L, </w:t>
       </w:r>
-    </w:p>
-    <w:p>
-      <w:pPr>
-        <w:spacing w:after="160"/>
-      </w:pPr>
+      <w:r>
+        <w:rPr>
+          <w:b w:val="0"/>
+          <w:i w:val="0"/>
+          <w:u w:val="single"/>
+        </w:rPr>
+        <w:t>Rausch A</w:t>
+      </w:r>
       <w:r>
         <w:rPr>
           <w:b w:val="0"/>
           <w:i w:val="0"/>
         </w:rPr>
-        <w:t>Morgan JC, Rios J, Kahl T, Prasad M, Rausch A, Longman R, Mehra S, Shaaban A, Premkumar A. Management of monochorionic diamniotic twin gestation affected by Type-II selective fetal growth restriction: cost-effectiveness analysis. Ultrasound Obstet Gynecol. 2025</w:t>
+        <w:t>, Snellings JT, &amp; Rochelson B. Perceptual distortions during simultaneous continuous monitoring of fetal and maternal heart rate in laboring patients. The Journal of Maternal-Fetal &amp; Neonatal Medicine, 2026</w:t>
       </w:r>
     </w:p>
     <w:p>
       <w:pPr>
-        <w:spacing w:after="160"/>
+        <w:tabs>
+          <w:tab w:pos="450" w:val="left"/>
+        </w:tabs>
+        <w:spacing w:after="220"/>
+        <w:ind w:left="450" w:hanging="360"/>
       </w:pPr>
+      <w:r>
+        <w:t>4.</w:t>
+        <w:tab/>
+      </w:r>
       <w:r>
         <w:rPr>
           <w:b w:val="0"/>
           <w:i w:val="0"/>
         </w:rPr>
-        <w:t>Burns LP, Potchileev S, Mueller A, Azzi M, Premkumar A, Peterson J, Rausch A, Gonzalez M, Silasi M, Karumanchi SA, Thadhani R, Rana S. Real-world evidence for the utility of serum soluble fms-like tyrosine kinase 1/placental growth factor test for routine clinical evaluation of hospitalized women with hypertensive disorders of pregnancy. Am J Obstet Gynecol. 2025</w:t>
+        <w:t xml:space="preserve">Morgan JC, Rios J, Kahl T, Prasad M, </w:t>
       </w:r>
-    </w:p>
-    <w:p>
-      <w:pPr>
-        <w:spacing w:after="160"/>
-      </w:pPr>
+      <w:r>
+        <w:rPr>
+          <w:b w:val="0"/>
+          <w:i w:val="0"/>
+          <w:u w:val="single"/>
+        </w:rPr>
+        <w:t>Rausch A</w:t>
+      </w:r>
       <w:r>
         <w:rPr>
           <w:b w:val="0"/>
           <w:i w:val="0"/>
         </w:rPr>
-        <w:t>Ploran EJ, Soni S, Snellings JT, Rausch A, Rochelson B. The effect of perceptual decision-making on the interpretation of twin fetal heart rate tracings. The Journal of Maternal-Fetal &amp; Neonatal Medicine. 2022.</w:t>
+        <w:t>, Longman R, Mehra S, Shaaban A, Premkumar A. Management of monochorionic diamniotic twin gestation affected by Type-II selective fetal growth restriction: cost-effectiveness analysis. Ultrasound Obstet Gynecol. 2025</w:t>
       </w:r>
     </w:p>
     <w:p>
       <w:pPr>
-        <w:spacing w:after="160"/>
+        <w:tabs>
+          <w:tab w:pos="450" w:val="left"/>
+        </w:tabs>
+        <w:spacing w:after="220"/>
+        <w:ind w:left="450" w:hanging="360"/>
       </w:pPr>
+      <w:r>
+        <w:t>5.</w:t>
+        <w:tab/>
+      </w:r>
       <w:r>
         <w:rPr>
           <w:b w:val="0"/>
           <w:i w:val="0"/>
         </w:rPr>
-        <w:t>Blitz MJ, Gerber RP, Gulersen M, Shan W, Rausch AC, Prasannan L, Meirowitz N, Rochelson B. Preterm birth among women with and without severe acute respiratory syndrome coronavirus 2 infection. Acta Obstet Gynecol Scand. 2021</w:t>
+        <w:t xml:space="preserve">Burns LP, Potchileev S, Mueller A, Azzi M, Premkumar A, Peterson J, </w:t>
       </w:r>
-    </w:p>
-    <w:p>
-      <w:pPr>
-        <w:spacing w:after="160"/>
-      </w:pPr>
+      <w:r>
+        <w:rPr>
+          <w:b w:val="0"/>
+          <w:i w:val="0"/>
+          <w:u w:val="single"/>
+        </w:rPr>
+        <w:t>Rausch A</w:t>
+      </w:r>
       <w:r>
         <w:rPr>
           <w:b w:val="0"/>
           <w:i w:val="0"/>
         </w:rPr>
-        <w:t>Blitz MJ, Rochelson B, Rausch AC, Solmonovich R, Shan W, Combs A, Nimaroff M. Universal testing for coronavirus disease 2019 in pregnant women admitted for delivery: prevalence of peripartum infection and rate of asymptomatic carriers at four New York hospitals within an integrated healthcare system. American Journal of Obstetrics &amp; Gynecology MFM. 2020;2(3):100169.</w:t>
+        <w:t>, Gonzalez M, Silasi M, Karumanchi SA, Thadhani R, Rana S. Real-world evidence for the utility of serum soluble fms-like tyrosine kinase 1/placental growth factor test for routine clinical evaluation of hospitalized women with hypertensive disorders of pregnancy. Am J Obstet Gynecol. 2025</w:t>
       </w:r>
     </w:p>
     <w:p>
       <w:pPr>
-        <w:spacing w:after="160"/>
+        <w:tabs>
+          <w:tab w:pos="450" w:val="left"/>
+        </w:tabs>
+        <w:spacing w:after="220"/>
+        <w:ind w:left="450" w:hanging="360"/>
       </w:pPr>
+      <w:r>
+        <w:t>6.</w:t>
+        <w:tab/>
+      </w:r>
       <w:r>
         <w:rPr>
           <w:b w:val="0"/>
           <w:i w:val="0"/>
         </w:rPr>
-        <w:t>Wieland D, Burke M, Rausch A, Bowman D, Bobby P. Impact of a Quality Improvement Initiative on the Episiotomy Rate at a Community Hospital. J Repro Med. 2017;62(6):615–620.</w:t>
+        <w:t xml:space="preserve">Ploran EJ, Soni S, Snellings JT, </w:t>
       </w:r>
-    </w:p>
-    <w:p>
-      <w:pPr>
-        <w:spacing w:after="160"/>
-      </w:pPr>
+      <w:r>
+        <w:rPr>
+          <w:b w:val="0"/>
+          <w:i w:val="0"/>
+          <w:u w:val="single"/>
+        </w:rPr>
+        <w:t>Rausch A</w:t>
+      </w:r>
       <w:r>
         <w:rPr>
           <w:b w:val="0"/>
           <w:i w:val="0"/>
         </w:rPr>
-        <w:t>Ohtani T, Bouix S, Hosokawa T, Saito Y, Eckbo R, Ballinger T, Rausch AC, Melonakos E, Kubicke M. Abnormalities in white matter connections between orbitofrontal cortex and anterior cingulate cortex and their associations with negative symptoms in schizophrenia: A DTI study. Schizophrenia Research. 2014;157(1–3):190–197.</w:t>
+        <w:t>, Rochelson B. The effect of perceptual decision-making on the interpretation of twin fetal heart rate tracings. The Journal of Maternal-Fetal &amp; Neonatal Medicine. 2022.</w:t>
       </w:r>
     </w:p>
     <w:p>
       <w:pPr>
-        <w:spacing w:after="160"/>
+        <w:tabs>
+          <w:tab w:pos="450" w:val="left"/>
+        </w:tabs>
+        <w:spacing w:after="220"/>
+        <w:ind w:left="450" w:hanging="360"/>
       </w:pPr>
+      <w:r>
+        <w:t>7.</w:t>
+        <w:tab/>
+      </w:r>
       <w:r>
         <w:rPr>
           <w:b w:val="0"/>
           <w:i w:val="0"/>
         </w:rPr>
-        <w:t>Rao M, Concannon TW, Iovin R, Yu W, Chan J, Lypas G, Terasawa T, Gaylor J, Kong L, Rausch AC, Lau J, Kitsios G. Identification of topics for comparative effectiveness systematic reviews in the field of cancer imaging. Journal of Comparative Effectiveness Research. 2013;2(5):483–495.</w:t>
+        <w:t xml:space="preserve">Blitz MJ, Gerber RP, Gulersen M, Shan W, </w:t>
       </w:r>
-    </w:p>
-    <w:p>
-      <w:pPr>
-        <w:spacing w:after="160"/>
-      </w:pPr>
+      <w:r>
+        <w:rPr>
+          <w:b w:val="0"/>
+          <w:i w:val="0"/>
+          <w:u w:val="single"/>
+        </w:rPr>
+        <w:t>Rausch AC</w:t>
+      </w:r>
       <w:r>
         <w:rPr>
           <w:b w:val="0"/>
           <w:i w:val="0"/>
         </w:rPr>
-        <w:t>Whitford TJ, Savadjiev P, Kubicki M, O’Donnell L, Terry D, Bouix S, Westin CF, Schneiderman J, Bobrow L, Rausch AC, Niznikiewicz M, Nestor P, Pantelis C, Wood S, McCarley R, Shenton M. Fiber geometry in the corpus callosum in schizophrenia: Evidence for transcallosal misconnection. Schizophrenia Research. 2011;132(1):69–74.</w:t>
+        <w:t>, Prasannan L, Meirowitz N, Rochelson B. Preterm birth among women with and without severe acute respiratory syndrome coronavirus 2 infection. Acta Obstet Gynecol Scand. 2021</w:t>
       </w:r>
     </w:p>
     <w:p>
+      <w:pPr>
+        <w:tabs>
+          <w:tab w:pos="450" w:val="left"/>
+        </w:tabs>
+        <w:spacing w:after="220"/>
+        <w:ind w:left="450" w:hanging="360"/>
+      </w:pPr>
+      <w:r>
+        <w:t>8.</w:t>
+        <w:tab/>
+      </w:r>
       <w:r>
         <w:rPr>
           <w:b w:val="0"/>
           <w:i w:val="0"/>
         </w:rPr>
-        <w:t>Whitford TJ, Mathalon DH, Shenton ME, Roach BJ, Bammer R, Adcock RA, Bouix S, Kubicki M, De Siebenthal J, Rausch AC, Schneiderman J, Ford JM. Electrophysiological and diffusion tensor imaging evidence of delayed corollary discharges in patients with schizophrenia. Psychol Med. 2011;41(5):959–969.</w:t>
+        <w:t xml:space="preserve">Blitz MJ, Rochelson B, </w:t>
+      </w:r>
+      <w:r>
+        <w:rPr>
+          <w:b w:val="0"/>
+          <w:i w:val="0"/>
+          <w:u w:val="single"/>
+        </w:rPr>
+        <w:t>Rausch AC</w:t>
+      </w:r>
+      <w:r>
+        <w:rPr>
+          <w:b w:val="0"/>
+          <w:i w:val="0"/>
+        </w:rPr>
+        <w:t>, Solmonovich R, Shan W, Combs A, Nimaroff M. Universal testing for coronavirus disease 2019 in pregnant women admitted for delivery: prevalence of peripartum infection and rate of asymptomatic carriers at four New York hospitals within an integrated healthcare system. American Journal of Obstetrics &amp; Gynecology MFM. 2020;2(3):100169.</w:t>
       </w:r>
     </w:p>
     <w:p>
       <w:pPr>
-        <w:spacing w:before="120"/>
+        <w:tabs>
+          <w:tab w:pos="450" w:val="left"/>
+        </w:tabs>
+        <w:spacing w:after="220"/>
+        <w:ind w:left="450" w:hanging="360"/>
+      </w:pPr>
+      <w:r>
+        <w:t>9.</w:t>
+        <w:tab/>
+      </w:r>
+      <w:r>
+        <w:rPr>
+          <w:b w:val="0"/>
+          <w:i w:val="0"/>
+        </w:rPr>
+        <w:t xml:space="preserve">Wieland D, Burke M, </w:t>
+      </w:r>
+      <w:r>
+        <w:rPr>
+          <w:b w:val="0"/>
+          <w:i w:val="0"/>
+          <w:u w:val="single"/>
+        </w:rPr>
+        <w:t>Rausch A</w:t>
+      </w:r>
+      <w:r>
+        <w:rPr>
+          <w:b w:val="0"/>
+          <w:i w:val="0"/>
+        </w:rPr>
+        <w:t>, Bowman D, Bobby P. Impact of a Quality Improvement Initiative on the Episiotomy Rate at a Community Hospital. J Repro Med. 2017;62(6):615–620.</w:t>
+      </w:r>
+    </w:p>
+    <w:p>
+      <w:pPr>
+        <w:tabs>
+          <w:tab w:pos="450" w:val="left"/>
+        </w:tabs>
+        <w:spacing w:after="220"/>
+        <w:ind w:left="450" w:hanging="360"/>
+      </w:pPr>
+      <w:r>
+        <w:t>10.</w:t>
+        <w:tab/>
+      </w:r>
+      <w:r>
+        <w:rPr>
+          <w:b w:val="0"/>
+          <w:i w:val="0"/>
+        </w:rPr>
+        <w:t xml:space="preserve">Ohtani T, Bouix S, Hosokawa T, Saito Y, Eckbo R, Ballinger T, </w:t>
+      </w:r>
+      <w:r>
+        <w:rPr>
+          <w:b w:val="0"/>
+          <w:i w:val="0"/>
+          <w:u w:val="single"/>
+        </w:rPr>
+        <w:t>Rausch AC</w:t>
+      </w:r>
+      <w:r>
+        <w:rPr>
+          <w:b w:val="0"/>
+          <w:i w:val="0"/>
+        </w:rPr>
+        <w:t>, Melonakos E, Kubicke M. Abnormalities in white matter connections between orbitofrontal cortex and anterior cingulate cortex and their associations with negative symptoms in schizophrenia: A DTI study. Schizophrenia Research. 2014;157(1–3):190–197.</w:t>
+      </w:r>
+    </w:p>
+    <w:p>
+      <w:pPr>
+        <w:tabs>
+          <w:tab w:pos="450" w:val="left"/>
+        </w:tabs>
+        <w:spacing w:after="220"/>
+        <w:ind w:left="450" w:hanging="360"/>
+      </w:pPr>
+      <w:r>
+        <w:t>11.</w:t>
+        <w:tab/>
+      </w:r>
+      <w:r>
+        <w:rPr>
+          <w:b w:val="0"/>
+          <w:i w:val="0"/>
+        </w:rPr>
+        <w:t xml:space="preserve">Rao M, Concannon TW, Iovin R, Yu W, Chan J, Lypas G, Terasawa T, Gaylor J, Kong L, </w:t>
+      </w:r>
+      <w:r>
+        <w:rPr>
+          <w:b w:val="0"/>
+          <w:i w:val="0"/>
+          <w:u w:val="single"/>
+        </w:rPr>
+        <w:t>Rausch AC</w:t>
+      </w:r>
+      <w:r>
+        <w:rPr>
+          <w:b w:val="0"/>
+          <w:i w:val="0"/>
+        </w:rPr>
+        <w:t>, Lau J, Kitsios G. Identification of topics for comparative effectiveness systematic reviews in the field of cancer imaging. Journal of Comparative Effectiveness Research. 2013;2(5):483–495.</w:t>
+      </w:r>
+    </w:p>
+    <w:p>
+      <w:pPr>
+        <w:tabs>
+          <w:tab w:pos="450" w:val="left"/>
+        </w:tabs>
+        <w:spacing w:after="220"/>
+        <w:ind w:left="450" w:hanging="360"/>
+      </w:pPr>
+      <w:r>
+        <w:t>12.</w:t>
+        <w:tab/>
+      </w:r>
+      <w:r>
+        <w:rPr>
+          <w:b w:val="0"/>
+          <w:i w:val="0"/>
+        </w:rPr>
+        <w:t xml:space="preserve">Whitford TJ, Savadjiev P, Kubicki M, O’Donnell L, Terry D, Bouix S, Westin CF, Schneiderman J, Bobrow L, </w:t>
+      </w:r>
+      <w:r>
+        <w:rPr>
+          <w:b w:val="0"/>
+          <w:i w:val="0"/>
+          <w:u w:val="single"/>
+        </w:rPr>
+        <w:t>Rausch AC</w:t>
+      </w:r>
+      <w:r>
+        <w:rPr>
+          <w:b w:val="0"/>
+          <w:i w:val="0"/>
+        </w:rPr>
+        <w:t>, Niznikiewicz M, Nestor P, Pantelis C, Wood S, McCarley R, Shenton M. Fiber geometry in the corpus callosum in schizophrenia: Evidence for transcallosal misconnection. Schizophrenia Research. 2011;132(1):69–74.</w:t>
+      </w:r>
+    </w:p>
+    <w:p>
+      <w:pPr>
+        <w:tabs>
+          <w:tab w:pos="450" w:val="left"/>
+        </w:tabs>
+        <w:ind w:left="450" w:hanging="360"/>
+      </w:pPr>
+      <w:r>
+        <w:t>13.</w:t>
+        <w:tab/>
+      </w:r>
+      <w:r>
+        <w:rPr>
+          <w:b w:val="0"/>
+          <w:i w:val="0"/>
+        </w:rPr>
+        <w:t xml:space="preserve">Whitford TJ, Mathalon DH, Shenton ME, Roach BJ, Bammer R, Adcock RA, Bouix S, Kubicki M, De Siebenthal J, </w:t>
+      </w:r>
+      <w:r>
+        <w:rPr>
+          <w:b w:val="0"/>
+          <w:i w:val="0"/>
+          <w:u w:val="single"/>
+        </w:rPr>
+        <w:t>Rausch AC</w:t>
+      </w:r>
+      <w:r>
+        <w:rPr>
+          <w:b w:val="0"/>
+          <w:i w:val="0"/>
+        </w:rPr>
+        <w:t>, Schneiderman J, Ford JM. Electrophysiological and diffusion tensor imaging evidence of delayed corollary discharges in patients with schizophrenia. Psychol Med. 2011;41(5):959–969.</w:t>
+      </w:r>
+    </w:p>
+    <w:p>
+      <w:pPr>
+        <w:keepNext/>
+        <w:spacing w:before="160"/>
       </w:pPr>
       <w:r>
         <w:rPr>
-          <w:b/>
+          <w:b w:val="0"/>
+          <w:i/>
+          <w:u w:val="single"/>
         </w:rPr>
         <w:t>(b) Peer-reviewed works in non-traditional outlets</w:t>
       </w:r>
@@ -1568,11 +1947,14 @@
     </w:p>
     <w:p>
       <w:pPr>
-        <w:spacing w:before="120"/>
+        <w:keepNext/>
+        <w:spacing w:before="160"/>
       </w:pPr>
       <w:r>
         <w:rPr>
-          <w:b/>
+          <w:b w:val="0"/>
+          <w:i/>
+          <w:u w:val="single"/>
         </w:rPr>
         <w:t>(c) Peer-reviewed works accepted or in press</w:t>
       </w:r>
@@ -1584,11 +1966,14 @@
     </w:p>
     <w:p>
       <w:pPr>
-        <w:spacing w:before="120"/>
+        <w:keepNext/>
+        <w:spacing w:before="160"/>
       </w:pPr>
       <w:r>
         <w:rPr>
-          <w:b/>
+          <w:b w:val="0"/>
+          <w:i/>
+          <w:u w:val="single"/>
         </w:rPr>
         <w:t>(d) Non-peer-reviewed original articles</w:t>
       </w:r>
@@ -1600,11 +1985,14 @@
     </w:p>
     <w:p>
       <w:pPr>
-        <w:spacing w:before="120"/>
+        <w:keepNext/>
+        <w:spacing w:before="160"/>
       </w:pPr>
       <w:r>
         <w:rPr>
-          <w:b/>
+          <w:b w:val="0"/>
+          <w:i/>
+          <w:u w:val="single"/>
         </w:rPr>
         <w:t>(e) Books</w:t>
       </w:r>
@@ -1616,155 +2004,364 @@
     </w:p>
     <w:p>
       <w:pPr>
-        <w:spacing w:before="120"/>
+        <w:keepNext/>
+        <w:spacing w:before="160"/>
       </w:pPr>
       <w:r>
         <w:rPr>
-          <w:b/>
+          <w:b w:val="0"/>
+          <w:i/>
+          <w:u w:val="single"/>
         </w:rPr>
         <w:t>(f) Book chapters</w:t>
       </w:r>
     </w:p>
     <w:p>
       <w:pPr>
-        <w:spacing w:after="160"/>
+        <w:tabs>
+          <w:tab w:pos="450" w:val="left"/>
+        </w:tabs>
+        <w:spacing w:after="220"/>
+        <w:ind w:left="450" w:hanging="360"/>
       </w:pPr>
+      <w:r>
+        <w:t>1.</w:t>
+        <w:tab/>
+      </w:r>
       <w:r>
         <w:rPr>
           <w:b w:val="0"/>
           <w:i w:val="0"/>
         </w:rPr>
-        <w:t>Meirowitz N, Sharma R, Rausch AC. Antenatal care for postbariatric women, in Mahmood T, Arulkumaran S &amp; Chervenak FA (2nd ed) Obesity and Obstetrics. pp 105–115. 2020</w:t>
+        <w:t xml:space="preserve">Meirowitz N, Sharma R, </w:t>
       </w:r>
-    </w:p>
-    <w:p>
-      <w:pPr>
-        <w:spacing w:after="160"/>
-      </w:pPr>
+      <w:r>
+        <w:rPr>
+          <w:b w:val="0"/>
+          <w:i w:val="0"/>
+          <w:u w:val="single"/>
+        </w:rPr>
+        <w:t>Rausch AC</w:t>
+      </w:r>
       <w:r>
         <w:rPr>
           <w:b w:val="0"/>
           <w:i w:val="0"/>
         </w:rPr>
-        <w:t>Rausch AC, Longman RE. CHARGE Syndrome, in Copel J, D’Alton ME, Feltovich H, et al. Obstetric Imaging: Fetal Diagnosis and Care, 3rd Ed. In press.</w:t>
+        <w:t>. Antenatal care for postbariatric women, in Mahmood T, Arulkumaran S &amp; Chervenak FA (2nd ed) Obesity and Obstetrics. pp 105–115. 2020</w:t>
       </w:r>
     </w:p>
     <w:p>
       <w:pPr>
-        <w:spacing w:after="160"/>
+        <w:tabs>
+          <w:tab w:pos="450" w:val="left"/>
+        </w:tabs>
+        <w:spacing w:after="220"/>
+        <w:ind w:left="450" w:hanging="360"/>
       </w:pPr>
+      <w:r>
+        <w:t>2.</w:t>
+        <w:tab/>
+      </w:r>
+      <w:r>
+        <w:rPr>
+          <w:b w:val="0"/>
+          <w:i w:val="0"/>
+          <w:u w:val="single"/>
+        </w:rPr>
+        <w:t>Rausch AC</w:t>
+      </w:r>
       <w:r>
         <w:rPr>
           <w:b w:val="0"/>
           <w:i w:val="0"/>
         </w:rPr>
-        <w:t>Rausch AC, Longman RE. Klippel-Trenaunay-Weber Syndrome, in Copel J, D’Alton ME, Feltovich H, et al. Obstetric Imaging: Fetal Diagnosis and Care, 3rd Ed. In press.</w:t>
+        <w:t>, Longman RE. CHARGE Syndrome, in Copel J, D’Alton ME, Feltovich H, et al. Obstetric Imaging: Fetal Diagnosis and Care, 3rd Ed. In press.</w:t>
       </w:r>
     </w:p>
     <w:p>
+      <w:pPr>
+        <w:tabs>
+          <w:tab w:pos="450" w:val="left"/>
+        </w:tabs>
+        <w:spacing w:after="220"/>
+        <w:ind w:left="450" w:hanging="360"/>
+      </w:pPr>
+      <w:r>
+        <w:t>3.</w:t>
+        <w:tab/>
+      </w:r>
+      <w:r>
+        <w:rPr>
+          <w:b w:val="0"/>
+          <w:i w:val="0"/>
+          <w:u w:val="single"/>
+        </w:rPr>
+        <w:t>Rausch AC</w:t>
+      </w:r>
       <w:r>
         <w:rPr>
           <w:b w:val="0"/>
           <w:i w:val="0"/>
         </w:rPr>
-        <w:t>Rausch AC, Longman RE. Neu-Laxova Syndrome, in Copel J, D’Alton ME, Feltovich H, et al. Obstetric Imaging: Fetal Diagnosis and Care, 3rd Ed. In press.</w:t>
+        <w:t>, Longman RE. Klippel-Trenaunay-Weber Syndrome, in Copel J, D’Alton ME, Feltovich H, et al. Obstetric Imaging: Fetal Diagnosis and Care, 3rd Ed. In press.</w:t>
       </w:r>
     </w:p>
     <w:p>
       <w:pPr>
-        <w:spacing w:before="120"/>
+        <w:tabs>
+          <w:tab w:pos="450" w:val="left"/>
+        </w:tabs>
+        <w:ind w:left="450" w:hanging="360"/>
+      </w:pPr>
+      <w:r>
+        <w:t>4.</w:t>
+        <w:tab/>
+      </w:r>
+      <w:r>
+        <w:rPr>
+          <w:b w:val="0"/>
+          <w:i w:val="0"/>
+          <w:u w:val="single"/>
+        </w:rPr>
+        <w:t>Rausch AC</w:t>
+      </w:r>
+      <w:r>
+        <w:rPr>
+          <w:b w:val="0"/>
+          <w:i w:val="0"/>
+        </w:rPr>
+        <w:t>, Longman RE. Neu-Laxova Syndrome, in Copel J, D’Alton ME, Feltovich H, et al. Obstetric Imaging: Fetal Diagnosis and Care, 3rd Ed. In press.</w:t>
+      </w:r>
+    </w:p>
+    <w:p>
+      <w:pPr>
+        <w:keepNext/>
+        <w:spacing w:before="160"/>
       </w:pPr>
       <w:r>
         <w:rPr>
-          <w:b/>
+          <w:b w:val="0"/>
+          <w:i/>
+          <w:u w:val="single"/>
         </w:rPr>
         <w:t>(g) Other works</w:t>
       </w:r>
     </w:p>
     <w:p>
       <w:pPr>
-        <w:spacing w:after="160"/>
+        <w:tabs>
+          <w:tab w:pos="450" w:val="left"/>
+        </w:tabs>
+        <w:spacing w:after="220"/>
+        <w:ind w:left="450" w:hanging="360"/>
       </w:pPr>
+      <w:r>
+        <w:t>1.</w:t>
+        <w:tab/>
+      </w:r>
+      <w:r>
+        <w:rPr>
+          <w:b w:val="0"/>
+          <w:i w:val="0"/>
+          <w:u w:val="single"/>
+        </w:rPr>
+        <w:t>Rausch AC</w:t>
+      </w:r>
       <w:r>
         <w:rPr>
           <w:b w:val="0"/>
           <w:i w:val="0"/>
         </w:rPr>
-        <w:t>Rausch AC, Segal O, Speicher A, Dimijian D, Rochelson B. Fetal weight estimation using neural networks. 2020 AIUM Annual Meeting. – Invited for oral presentation but not given due to COVID-19 related cancellation.</w:t>
+        <w:t>, Segal O, Speicher A, Dimijian D, Rochelson B. Fetal weight estimation using neural networks. 2020 AIUM Annual Meeting. – Invited for oral presentation but not given due to COVID-19 related cancellation.</w:t>
       </w:r>
     </w:p>
     <w:p>
       <w:pPr>
-        <w:spacing w:after="160"/>
+        <w:tabs>
+          <w:tab w:pos="450" w:val="left"/>
+        </w:tabs>
+        <w:spacing w:after="220"/>
+        <w:ind w:left="450" w:hanging="360"/>
       </w:pPr>
+      <w:r>
+        <w:t>2.</w:t>
+        <w:tab/>
+      </w:r>
       <w:r>
         <w:rPr>
           <w:b w:val="0"/>
           <w:i w:val="0"/>
         </w:rPr>
-        <w:t>Boll ME, Chandrasekaran S, Sohail S, Rausch AC, Premkumar A. The relationship between placental efficiency score and adverse neonatal outcomes in pregnancies complicated by fetal growth restriction. SMFM 2026 Global Congress, Utrecht, Netherlands. October 2026. Poster presentation.</w:t>
+        <w:t xml:space="preserve">Boll ME, Chandrasekaran S, Sohail S, </w:t>
       </w:r>
-    </w:p>
-    <w:p>
-      <w:pPr>
-        <w:spacing w:after="160"/>
-      </w:pPr>
+      <w:r>
+        <w:rPr>
+          <w:b w:val="0"/>
+          <w:i w:val="0"/>
+          <w:u w:val="single"/>
+        </w:rPr>
+        <w:t>Rausch AC</w:t>
+      </w:r>
       <w:r>
         <w:rPr>
           <w:b w:val="0"/>
           <w:i w:val="0"/>
         </w:rPr>
-        <w:t>Burns LP, Evans C, Rausch AC. Exam Indicated Cerclage Low Fidelity Training Model. ABOG Simulation Summit. 2026.</w:t>
+        <w:t>, Premkumar A. The relationship between placental efficiency score and adverse neonatal outcomes in pregnancies complicated by fetal growth restriction. SMFM 2026 Global Congress, Utrecht, Netherlands. October 2026. Poster presentation.</w:t>
       </w:r>
     </w:p>
     <w:p>
       <w:pPr>
-        <w:spacing w:after="160"/>
+        <w:tabs>
+          <w:tab w:pos="450" w:val="left"/>
+        </w:tabs>
+        <w:spacing w:after="220"/>
+        <w:ind w:left="450" w:hanging="360"/>
       </w:pPr>
+      <w:r>
+        <w:t>3.</w:t>
+        <w:tab/>
+      </w:r>
       <w:r>
         <w:rPr>
           <w:b w:val="0"/>
           <w:i w:val="0"/>
         </w:rPr>
-        <w:t>Mills K, Rausch AC. Managing Needs: Fellow-Resident Interactions and Optimizing the Learning Environment for All. Greater General Surgery Grand Rounds, University of Chicago. Feb 25, 2026.</w:t>
+        <w:t xml:space="preserve">Burns LP, Evans C, </w:t>
       </w:r>
-    </w:p>
-    <w:p>
-      <w:pPr>
-        <w:spacing w:after="160"/>
-      </w:pPr>
+      <w:r>
+        <w:rPr>
+          <w:b w:val="0"/>
+          <w:i w:val="0"/>
+          <w:u w:val="single"/>
+        </w:rPr>
+        <w:t>Rausch AC</w:t>
+      </w:r>
       <w:r>
         <w:rPr>
           <w:b w:val="0"/>
           <w:i w:val="0"/>
         </w:rPr>
-        <w:t>Rausch AC. Preterm Labor: Diagnosis, Management, and Prevention. On-demand Webinar, Association of Physician Associates in Obstetrics and Gynecology. December 2024. Available online at https://apaog.org/webinars</w:t>
+        <w:t>. Exam Indicated Cerclage Low Fidelity Training Model. ABOG Simulation Summit. 2026.</w:t>
       </w:r>
     </w:p>
     <w:p>
+      <w:pPr>
+        <w:tabs>
+          <w:tab w:pos="450" w:val="left"/>
+        </w:tabs>
+        <w:spacing w:after="220"/>
+        <w:ind w:left="450" w:hanging="360"/>
+      </w:pPr>
+      <w:r>
+        <w:t>4.</w:t>
+        <w:tab/>
+      </w:r>
       <w:r>
         <w:rPr>
           <w:b w:val="0"/>
           <w:i w:val="0"/>
         </w:rPr>
-        <w:t>Rausch AC, Dalal S, Kellar A. Preconception Through Postpartum: Updates in IBD Management and a Multidisciplinary Care Approach. February 2026.</w:t>
+        <w:t xml:space="preserve">Mills K, </w:t>
+      </w:r>
+      <w:r>
+        <w:rPr>
+          <w:b w:val="0"/>
+          <w:i w:val="0"/>
+          <w:u w:val="single"/>
+        </w:rPr>
+        <w:t>Rausch AC</w:t>
+      </w:r>
+      <w:r>
+        <w:rPr>
+          <w:b w:val="0"/>
+          <w:i w:val="0"/>
+        </w:rPr>
+        <w:t>. Managing Needs: Fellow-Resident Interactions and Optimizing the Learning Environment for All. Greater General Surgery Grand Rounds, University of Chicago. Feb 25, 2026.</w:t>
       </w:r>
     </w:p>
     <w:p>
       <w:pPr>
-        <w:spacing w:before="120"/>
+        <w:tabs>
+          <w:tab w:pos="450" w:val="left"/>
+        </w:tabs>
+        <w:spacing w:after="220"/>
+        <w:ind w:left="450" w:hanging="360"/>
+      </w:pPr>
+      <w:r>
+        <w:t>5.</w:t>
+        <w:tab/>
+      </w:r>
+      <w:r>
+        <w:rPr>
+          <w:b w:val="0"/>
+          <w:i w:val="0"/>
+          <w:u w:val="single"/>
+        </w:rPr>
+        <w:t>Rausch AC</w:t>
+      </w:r>
+      <w:r>
+        <w:rPr>
+          <w:b w:val="0"/>
+          <w:i w:val="0"/>
+        </w:rPr>
+        <w:t>. Preterm Labor: Diagnosis, Management, and Prevention. On-demand Webinar, Association of Physician Associates in Obstetrics and Gynecology. December 2024. Available online at https://apaog.org/webinars</w:t>
+      </w:r>
+    </w:p>
+    <w:p>
+      <w:pPr>
+        <w:tabs>
+          <w:tab w:pos="450" w:val="left"/>
+        </w:tabs>
+        <w:ind w:left="450" w:hanging="360"/>
+      </w:pPr>
+      <w:r>
+        <w:t>6.</w:t>
+        <w:tab/>
+      </w:r>
+      <w:r>
+        <w:rPr>
+          <w:b w:val="0"/>
+          <w:i w:val="0"/>
+          <w:u w:val="single"/>
+        </w:rPr>
+        <w:t>Rausch AC</w:t>
+      </w:r>
+      <w:r>
+        <w:rPr>
+          <w:b w:val="0"/>
+          <w:i w:val="0"/>
+        </w:rPr>
+        <w:t>, Dalal S, Kellar A. Preconception Through Postpartum: Updates in IBD Management and a Multidisciplinary Care Approach. February 2026.</w:t>
+      </w:r>
+    </w:p>
+    <w:p>
+      <w:pPr>
+        <w:keepNext/>
+        <w:spacing w:before="160"/>
       </w:pPr>
       <w:r>
         <w:rPr>
-          <w:b/>
+          <w:b w:val="0"/>
+          <w:i/>
+          <w:u w:val="single"/>
         </w:rPr>
         <w:t>(h) Clinical trials ongoing, unpublished</w:t>
       </w:r>
     </w:p>
     <w:p>
       <w:pPr>
-        <w:spacing w:after="160"/>
+        <w:tabs>
+          <w:tab w:pos="450" w:val="left"/>
+        </w:tabs>
+        <w:spacing w:after="220"/>
+        <w:ind w:left="450" w:hanging="360"/>
       </w:pPr>
+      <w:r>
+        <w:t>1.</w:t>
+        <w:tab/>
+      </w:r>
       <w:r>
         <w:rPr>
           <w:b w:val="0"/>
@@ -1774,6 +2371,16 @@
       </w:r>
     </w:p>
     <w:p>
+      <w:pPr>
+        <w:tabs>
+          <w:tab w:pos="450" w:val="left"/>
+        </w:tabs>
+        <w:ind w:left="450" w:hanging="360"/>
+      </w:pPr>
+      <w:r>
+        <w:t>2.</w:t>
+        <w:tab/>
+      </w:r>
       <w:r>
         <w:rPr>
           <w:b w:val="0"/>
@@ -1784,11 +2391,14 @@
     </w:p>
     <w:p>
       <w:pPr>
-        <w:spacing w:before="120"/>
+        <w:keepNext/>
+        <w:spacing w:before="160"/>
       </w:pPr>
       <w:r>
         <w:rPr>
-          <w:b/>
+          <w:b w:val="0"/>
+          <w:i/>
+          <w:u w:val="single"/>
         </w:rPr>
         <w:t>(i) Works in review, preparation, etc.</w:t>
       </w:r>
@@ -1799,13 +2409,126 @@
       </w:r>
     </w:p>
     <w:sectPr>
+      <w:footerReference w:type="default" r:id="rId9"/>
       <w:pgSz w:w="12240" w:h="15840"/>
-      <w:pgMar w:top="1440" w:right="1440" w:bottom="1440" w:left="1440" w:header="720" w:footer="720" w:gutter="0"/>
+      <w:pgMar w:top="1440" w:right="990" w:bottom="1440" w:left="1440" w:header="720" w:footer="720" w:gutter="0"/>
       <w:cols w:space="720"/>
       <w:docGrid w:linePitch="360"/>
     </w:sectPr>
   </w:body>
 </w:document>
+</file>
+
+<file path=word/footer1.xml><?xml version="1.0" encoding="utf-8"?>
+<w:ftr xmlns:m="http://schemas.openxmlformats.org/officeDocument/2006/math" xmlns:mc="http://schemas.openxmlformats.org/markup-compatibility/2006" xmlns:mo="http://schemas.microsoft.com/office/mac/office/2008/main" xmlns:mv="urn:schemas-microsoft-com:mac:vml" xmlns:o="urn:schemas-microsoft-com:office:office" xmlns:r="http://schemas.openxmlformats.org/officeDocument/2006/relationships" xmlns:v="urn:schemas-microsoft-com:vml" xmlns:w10="urn:schemas-microsoft-com:office:word" xmlns:w14="http://schemas.microsoft.com/office/word/2010/wordml" xmlns:w="http://schemas.openxmlformats.org/wordprocessingml/2006/main" xmlns:wne="http://schemas.microsoft.com/office/word/2006/wordml" xmlns:wp14="http://schemas.microsoft.com/office/word/2010/wordprocessingDrawing" xmlns:wp="http://schemas.openxmlformats.org/drawingml/2006/wordprocessingDrawing" xmlns:wpc="http://schemas.microsoft.com/office/word/2010/wordprocessingCanvas" xmlns:wpg="http://schemas.microsoft.com/office/word/2010/wordprocessingGroup" xmlns:wpi="http://schemas.microsoft.com/office/word/2010/wordprocessingInk" xmlns:wps="http://schemas.microsoft.com/office/word/2010/wordprocessingShape" mc:Ignorable="w14 wp14">
+  <w:p>
+    <w:pPr>
+      <w:pStyle w:val="Footer"/>
+      <w:tabs>
+        <w:tab w:pos="4905" w:val="center"/>
+        <w:tab w:pos="9810" w:val="right"/>
+      </w:tabs>
+    </w:pPr>
+    <w:r>
+      <w:rPr>
+        <w:rFonts w:ascii="Calibri" w:hAnsi="Calibri"/>
+        <w:sz w:val="22"/>
+      </w:rPr>
+      <w:t>Andrew C Rausch MD</w:t>
+      <w:tab/>
+      <w:t>October 2026</w:t>
+      <w:tab/>
+      <w:t xml:space="preserve">Page </w:t>
+    </w:r>
+    <w:r>
+      <w:rPr>
+        <w:rFonts w:ascii="Calibri" w:hAnsi="Calibri"/>
+        <w:b/>
+        <w:sz w:val="22"/>
+      </w:rPr>
+      <w:fldChar w:fldCharType="begin"/>
+    </w:r>
+    <w:r>
+      <w:rPr>
+        <w:rFonts w:ascii="Calibri" w:hAnsi="Calibri"/>
+        <w:b/>
+        <w:sz w:val="22"/>
+      </w:rPr>
+      <w:instrText xml:space="preserve"> PAGE </w:instrText>
+    </w:r>
+    <w:r>
+      <w:rPr>
+        <w:rFonts w:ascii="Calibri" w:hAnsi="Calibri"/>
+        <w:b/>
+        <w:sz w:val="22"/>
+      </w:rPr>
+      <w:fldChar w:fldCharType="separate"/>
+    </w:r>
+    <w:r>
+      <w:rPr>
+        <w:rFonts w:ascii="Calibri" w:hAnsi="Calibri"/>
+        <w:b/>
+        <w:sz w:val="22"/>
+      </w:rPr>
+      <w:t>1</w:t>
+    </w:r>
+    <w:r>
+      <w:rPr>
+        <w:rFonts w:ascii="Calibri" w:hAnsi="Calibri"/>
+        <w:b/>
+        <w:sz w:val="22"/>
+      </w:rPr>
+      <w:fldChar w:fldCharType="end"/>
+    </w:r>
+    <w:r>
+      <w:rPr>
+        <w:rFonts w:ascii="Calibri" w:hAnsi="Calibri"/>
+        <w:sz w:val="22"/>
+      </w:rPr>
+      <w:t xml:space="preserve"> of </w:t>
+    </w:r>
+    <w:r>
+      <w:rPr>
+        <w:rFonts w:ascii="Calibri" w:hAnsi="Calibri"/>
+        <w:b/>
+        <w:sz w:val="22"/>
+      </w:rPr>
+      <w:fldChar w:fldCharType="begin"/>
+    </w:r>
+    <w:r>
+      <w:rPr>
+        <w:rFonts w:ascii="Calibri" w:hAnsi="Calibri"/>
+        <w:b/>
+        <w:sz w:val="22"/>
+      </w:rPr>
+      <w:instrText xml:space="preserve"> NUMPAGES </w:instrText>
+    </w:r>
+    <w:r>
+      <w:rPr>
+        <w:rFonts w:ascii="Calibri" w:hAnsi="Calibri"/>
+        <w:b/>
+        <w:sz w:val="22"/>
+      </w:rPr>
+      <w:fldChar w:fldCharType="separate"/>
+    </w:r>
+    <w:r>
+      <w:rPr>
+        <w:rFonts w:ascii="Calibri" w:hAnsi="Calibri"/>
+        <w:b/>
+        <w:sz w:val="22"/>
+      </w:rPr>
+      <w:t>1</w:t>
+    </w:r>
+    <w:r>
+      <w:rPr>
+        <w:rFonts w:ascii="Calibri" w:hAnsi="Calibri"/>
+        <w:b/>
+        <w:sz w:val="22"/>
+      </w:rPr>
+      <w:fldChar w:fldCharType="end"/>
+    </w:r>
+  </w:p>
+</w:ftr>
 </file>
 
 <file path=word/numbering.xml><?xml version="1.0" encoding="utf-8"?>
@@ -2172,7 +2895,7 @@
     <w:qFormat/>
     <w:rsid w:val="00FC693F"/>
     <w:pPr>
-      <w:spacing w:before="0" w:after="40"/>
+      <w:spacing w:before="0" w:after="0" w:line="240" w:lineRule="auto"/>
     </w:pPr>
     <w:rPr>
       <w:rFonts w:ascii="Calibri" w:hAnsi="Calibri"/>

</xml_diff>

<commit_message>
CV: AIUM accreditation, fetal procedures, resident ultrasound curriculum, mfm.media, PF5 grant scaffold, birth weight manuscript in preparation
Co-Authored-By: Claude Fable 5.1 <noreply@anthropic.com>
</commit_message>
<xml_diff>
--- a/Andrew_Rausch_CV.docx
+++ b/Andrew_Rausch_CV.docx
@@ -31,7 +31,7 @@
         <w:jc w:val="right"/>
       </w:pPr>
       <w:r>
-        <w:t>Chicago, 10/8/26</w:t>
+        <w:t>Chicago, 10/14/26</w:t>
       </w:r>
     </w:p>
     <w:p/>
@@ -795,7 +795,19 @@
           <w:b w:val="0"/>
           <w:i w:val="0"/>
         </w:rPr>
-        <w:t>Designed and implemented a novel curriculum for resident training in obstetric and gynecologic ultrasound</w:t>
+        <w:t>Rotation Director, ultrasound rotation (2026). Designed and implemented a novel written curriculum for resident training in obstetric and gynecologic ultrasound, with graduated scanning and reading expectations (with Leah Hefelfinger, PGY-3)</w:t>
+      </w:r>
+    </w:p>
+    <w:p>
+      <w:pPr>
+        <w:ind w:left="1440"/>
+      </w:pPr>
+      <w:r>
+        <w:rPr>
+          <w:b w:val="0"/>
+          <w:i w:val="0"/>
+        </w:rPr>
+        <w:t>Built mfm.media (2026), a lecture library for the section hosting rebuilt resident lectures and interactive teaching models (fetal Doppler physiology, power calculations)</w:t>
       </w:r>
     </w:p>
     <w:p>
@@ -834,7 +846,6 @@
     </w:p>
     <w:p>
       <w:pPr>
-        <w:spacing w:after="220"/>
         <w:ind w:left="1440"/>
       </w:pPr>
       <w:r>
@@ -843,6 +854,31 @@
           <w:i w:val="0"/>
         </w:rPr>
         <w:t>Annual didactics: Ultrasound Basics; Fetal CNS Ultrasound; Pulse Wave Doppler in Fetal Ultrasound; First Trimester Detailed Anatomy; Fundamentals of Needle Guided Intervention (FUNGI) simulation</w:t>
+      </w:r>
+    </w:p>
+    <w:p>
+      <w:pPr>
+        <w:ind w:left="1440"/>
+      </w:pPr>
+      <w:r>
+        <w:rPr>
+          <w:b w:val="0"/>
+          <w:i w:val="0"/>
+        </w:rPr>
+        <w:t>Expanded FUNGI with low-fidelity trainers built in house: an exam-indicated cerclage model (ABOG Simulation Summit 2026) and a model of fetal intracardiac intervention</w:t>
+      </w:r>
+    </w:p>
+    <w:p>
+      <w:pPr>
+        <w:spacing w:after="220"/>
+        <w:ind w:left="1440"/>
+      </w:pPr>
+      <w:r>
+        <w:rPr>
+          <w:b w:val="0"/>
+          <w:i w:val="0"/>
+        </w:rPr>
+        <w:t>Programmed and deployed an offline intrauterine transfusion calculator for the fellows (2026)</w:t>
       </w:r>
     </w:p>
     <w:p>
@@ -1019,7 +1055,7 @@
         <w:ind w:left="1440" w:hanging="1440"/>
       </w:pPr>
       <w:r>
-        <w:t>2022–present</w:t>
+        <w:t>2022–2026</w:t>
         <w:tab/>
       </w:r>
       <w:r>
@@ -1191,7 +1227,7 @@
           <w:b w:val="0"/>
           <w:i w:val="0"/>
         </w:rPr>
-        <w:t>Director of Ultrasound, Department of Obstetrics &amp; Gynecology, University of Chicago. Assumed day-to-day operational leadership of the ultrasound unit in January 2026 following the departure of the prior director; formally appointed Director of Ultrasound in February 2026. Unit volume increased 7.3% over the first six months of leadership compared with the preceding six months (22,993 to 24,680 examinations); second-quarter 2026 volume reached 13,109 examinations, a 14.0% increase over the average of the two pre-transition quarters.</w:t>
+        <w:t>Director of Ultrasound, Department of Obstetrics &amp; Gynecology, University of Chicago. Assumed day-to-day operational leadership of the ultrasound unit in January 2026; formally appointed Director of Ultrasound in February 2026. The unit (Hyde Park, offsite locations, and affiliated FQHCs) achieved AIUM practice accreditation in September 2026, and scan volume has increased 10–12% year over year since the transition.</w:t>
       </w:r>
     </w:p>
     <w:p>
@@ -1212,7 +1248,7 @@
           <w:b w:val="0"/>
           <w:i w:val="0"/>
         </w:rPr>
-        <w:t>First-trimester detailed anatomy program, including AIUM practice accreditation</w:t>
+        <w:t>First-trimester detailed anatomy program, built to AIUM practice accreditation standards</w:t>
       </w:r>
     </w:p>
     <w:p>
@@ -1236,7 +1272,40 @@
           <w:b w:val="0"/>
           <w:i w:val="0"/>
         </w:rPr>
-        <w:t>Expansion of obstetric ultrasound services at Ingalls Memorial Hospital, including transition of obstetric imaging from Radiology</w:t>
+        <w:t>Expansion of obstetric ultrasound services at Ingalls Memorial Hospital, including transition of obstetric imaging from Radiology and guidance of the Radiology OB/Gyn ultrasound quality improvement program</w:t>
+      </w:r>
+    </w:p>
+    <w:p>
+      <w:r>
+        <w:rPr>
+          <w:b w:val="0"/>
+          <w:i w:val="0"/>
+        </w:rPr>
+        <w:t>Fetal procedures</w:t>
+      </w:r>
+    </w:p>
+    <w:p>
+      <w:pPr>
+        <w:ind w:left="1440"/>
+      </w:pPr>
+      <w:r>
+        <w:rPr>
+          <w:b w:val="0"/>
+          <w:i w:val="0"/>
+        </w:rPr>
+        <w:t>One of three section faculty performing fetal procedures: percutaneous umbilical blood sampling, intrauterine transfusion, and fetal shunt placement, in addition to induction of fetal asystole, selective reduction, amniocentesis, and chorionic villus sampling</w:t>
+      </w:r>
+    </w:p>
+    <w:p>
+      <w:pPr>
+        <w:ind w:left="1440"/>
+      </w:pPr>
+      <w:r>
+        <w:rPr>
+          <w:b w:val="0"/>
+          <w:i w:val="0"/>
+        </w:rPr>
+        <w:t>Sole current faculty member trained in Shirodkar cerclage placement</w:t>
       </w:r>
     </w:p>
     <w:p>
@@ -1458,7 +1527,7 @@
           <w:b w:val="0"/>
           <w:i w:val="0"/>
         </w:rPr>
-        <w:t>Leah Hefelfinger – University of Chicago/Endeavor Ob/Gyn resident (PGY-3) – Ultrasound curriculum survey for Ob/Gyn residency programs</w:t>
+        <w:t>Leah Hefelfinger – University of Chicago/Endeavor Ob/Gyn resident (PGY-3) – Resident ultrasound rotation curriculum; ultrasound curriculum survey for Ob/Gyn residency programs</w:t>
       </w:r>
     </w:p>
     <w:p>
@@ -2404,8 +2473,30 @@
       </w:r>
     </w:p>
     <w:p>
+      <w:pPr>
+        <w:tabs>
+          <w:tab w:pos="450" w:val="left"/>
+        </w:tabs>
+        <w:ind w:left="450" w:hanging="360"/>
+      </w:pPr>
       <w:r>
-        <w:t>None</w:t>
+        <w:t>1.</w:t>
+        <w:tab/>
+      </w:r>
+      <w:r>
+        <w:rPr>
+          <w:b w:val="0"/>
+          <w:i w:val="0"/>
+          <w:u w:val="single"/>
+        </w:rPr>
+        <w:t>Rausch AC</w:t>
+      </w:r>
+      <w:r>
+        <w:rPr>
+          <w:b w:val="0"/>
+          <w:i w:val="0"/>
+        </w:rPr>
+        <w:t>, et al. Neonatal birth weight prediction from fetal biometry: a benchmark of 13 model families from the Hadlock and Shepard formulas to modern machine learning, showing an asymptotic floor to average error regardless of method. Manuscript in preparation for Ultrasound in Obstetrics &amp; Gynecology, with planned extension to the Northwell Health delivery database (&gt;100,000 deliveries) and the INTERGROWTH-21st dataset.</w:t>
       </w:r>
     </w:p>
     <w:sectPr>

</xml_diff>

<commit_message>
CV: sync with faculty status report
- Copel chapters (CHARGE, Klippel-Trenaunay-Weber, Neu-Laxova) now published:
  Elsevier 2025, on the CV and publications.html
- PF5 grant (UChicago – Radboudumc) submitted; Grants section un-TBC'd
- SMFM Scientific Forum: Ultrasound, reinvited for 2027
- FNCC: Level I fetal therapy; alternate representative for NAFTNet
- Director of Ultrasound: written QA program
- Genetics and Ultrasound Case Conference, CME accreditation representative

Co-Authored-By: Claude Opus 5.5 (1M context) <noreply@anthropic.com>
</commit_message>
<xml_diff>
--- a/Andrew_Rausch_CV.docx
+++ b/Andrew_Rausch_CV.docx
@@ -767,6 +767,25 @@
     </w:p>
     <w:p>
       <w:pPr>
+        <w:tabs>
+          <w:tab w:pos="1440" w:val="left"/>
+        </w:tabs>
+        <w:ind w:left="1440" w:hanging="1440"/>
+      </w:pPr>
+      <w:r>
+        <w:t>2027</w:t>
+        <w:tab/>
+      </w:r>
+      <w:r>
+        <w:rPr>
+          <w:b w:val="0"/>
+          <w:i w:val="0"/>
+        </w:rPr>
+        <w:t>The Pregnancy Meeting – Scientific Forum: Ultrasound – Reinvited speaker (title forthcoming)</w:t>
+      </w:r>
+    </w:p>
+    <w:p>
+      <w:pPr>
         <w:keepNext/>
         <w:spacing w:before="240" w:after="0"/>
       </w:pPr>
@@ -1227,7 +1246,7 @@
           <w:b w:val="0"/>
           <w:i w:val="0"/>
         </w:rPr>
-        <w:t>Director of Ultrasound, Department of Obstetrics &amp; Gynecology, University of Chicago. Assumed day-to-day operational leadership of the ultrasound unit in January 2026; formally appointed Director of Ultrasound in February 2026. The unit (Hyde Park, offsite locations, and affiliated FQHCs) achieved AIUM practice accreditation in September 2026, and scan volume has increased 10–12% year over year since the transition.</w:t>
+        <w:t>Director of Ultrasound, Department of Obstetrics &amp; Gynecology, University of Chicago. Assumed day-to-day operational leadership of the ultrasound unit in January 2026; formally appointed Director of Ultrasound in February 2026. The unit (Hyde Park, offsite locations, and affiliated FQHCs) achieved AIUM practice accreditation in September 2026, and scan volume has increased 10–12% year over year since the transition. Developed and implemented a written quality assurance program for the unit.</w:t>
       </w:r>
     </w:p>
     <w:p>
@@ -1306,6 +1325,60 @@
           <w:i w:val="0"/>
         </w:rPr>
         <w:t>Sole current faculty member trained in Shirodkar cerclage placement</w:t>
+      </w:r>
+    </w:p>
+    <w:p>
+      <w:r>
+        <w:rPr>
+          <w:b w:val="0"/>
+          <w:i w:val="0"/>
+        </w:rPr>
+        <w:t>Fetal and Neonatal Care Center (FNCC)</w:t>
+      </w:r>
+    </w:p>
+    <w:p>
+      <w:pPr>
+        <w:ind w:left="1440"/>
+      </w:pPr>
+      <w:r>
+        <w:rPr>
+          <w:b w:val="0"/>
+          <w:i w:val="0"/>
+        </w:rPr>
+        <w:t>Level I fetal therapy capability</w:t>
+      </w:r>
+    </w:p>
+    <w:p>
+      <w:pPr>
+        <w:ind w:left="1440"/>
+      </w:pPr>
+      <w:r>
+        <w:rPr>
+          <w:b w:val="0"/>
+          <w:i w:val="0"/>
+        </w:rPr>
+        <w:t>Alternate Representative for the University of Chicago's membership in the North American Fetal Therapy Network (NAFTNet)</w:t>
+      </w:r>
+    </w:p>
+    <w:p>
+      <w:r>
+        <w:rPr>
+          <w:b w:val="0"/>
+          <w:i w:val="0"/>
+        </w:rPr>
+        <w:t>Genetics and Ultrasound Case Conference</w:t>
+      </w:r>
+    </w:p>
+    <w:p>
+      <w:pPr>
+        <w:ind w:left="1440"/>
+      </w:pPr>
+      <w:r>
+        <w:rPr>
+          <w:b w:val="0"/>
+          <w:i w:val="0"/>
+        </w:rPr>
+        <w:t>Lead the conference, a recurring CME-accredited multidisciplinary meeting, and serve as its official representative for CME accreditation</w:t>
       </w:r>
     </w:p>
     <w:p>
@@ -1539,6 +1612,37 @@
         <w:rPr>
           <w:b/>
         </w:rPr>
+        <w:t>GRANTS &amp; RESEARCH SUPPORT</w:t>
+      </w:r>
+    </w:p>
+    <w:p>
+      <w:pPr>
+        <w:tabs>
+          <w:tab w:pos="1440" w:val="left"/>
+        </w:tabs>
+        <w:ind w:left="1440" w:hanging="1440"/>
+      </w:pPr>
+      <w:r>
+        <w:t>2026</w:t>
+        <w:tab/>
+      </w:r>
+      <w:r>
+        <w:rPr>
+          <w:b w:val="0"/>
+          <w:i w:val="0"/>
+        </w:rPr>
+        <w:t>Co-Principal Investigator, PF5 international collaboration grant, University of Chicago – Radboudumc (Radboud University Medical Center, Nijmegen, Netherlands); Heather Whitney, PhD, UChicago PI. Uncertainty quantification for AI on medical imaging, with multimodal ovarian cancer characterization (MRI, ultrasound, proteomics, EHR) for differentiation, prognosis, and diagnosis of recurrence. Submitted 2026; pending review.</w:t>
+      </w:r>
+    </w:p>
+    <w:p>
+      <w:pPr>
+        <w:keepNext/>
+        <w:spacing w:before="240" w:after="0"/>
+      </w:pPr>
+      <w:r>
+        <w:rPr>
+          <w:b/>
+        </w:rPr>
         <w:t>BIBLIOGRAPHY</w:t>
       </w:r>
     </w:p>
@@ -2145,7 +2249,7 @@
           <w:b w:val="0"/>
           <w:i w:val="0"/>
         </w:rPr>
-        <w:t>, Longman RE. CHARGE Syndrome, in Copel J, D’Alton ME, Feltovich H, et al. Obstetric Imaging: Fetal Diagnosis and Care, 3rd Ed. In press.</w:t>
+        <w:t>, Longman RE. CHARGE Syndrome, in Copel J, D’Alton ME, Feltovich H, et al. Obstetric Imaging: Fetal Diagnosis and Care, 3rd Ed. Elsevier. 2025</w:t>
       </w:r>
     </w:p>
     <w:p>
@@ -2173,7 +2277,7 @@
           <w:b w:val="0"/>
           <w:i w:val="0"/>
         </w:rPr>
-        <w:t>, Longman RE. Klippel-Trenaunay-Weber Syndrome, in Copel J, D’Alton ME, Feltovich H, et al. Obstetric Imaging: Fetal Diagnosis and Care, 3rd Ed. In press.</w:t>
+        <w:t>, Longman RE. Klippel-Trenaunay-Weber Syndrome, in Copel J, D’Alton ME, Feltovich H, et al. Obstetric Imaging: Fetal Diagnosis and Care, 3rd Ed. Elsevier. 2025</w:t>
       </w:r>
     </w:p>
     <w:p>
@@ -2200,7 +2304,7 @@
           <w:b w:val="0"/>
           <w:i w:val="0"/>
         </w:rPr>
-        <w:t>, Longman RE. Neu-Laxova Syndrome, in Copel J, D’Alton ME, Feltovich H, et al. Obstetric Imaging: Fetal Diagnosis and Care, 3rd Ed. In press.</w:t>
+        <w:t>, Longman RE. Neu-Laxova Syndrome, in Copel J, D’Alton ME, Feltovich H, et al. Obstetric Imaging: Fetal Diagnosis and Care, 3rd Ed. Elsevier. 2025</w:t>
       </w:r>
     </w:p>
     <w:p>

</xml_diff>

<commit_message>
CV: PF5 details, ABOG name, Director entry, IBD clinic; Word build
- PF5: UChicago – Radboud University, submitted September 2026; replaces
  the Quantitative Ultrasound Biomarkers project under (h) and on index.html
- NAFTNet alternate representative since 2023
- Board certifications: American Board of Obstetrics and Gynecology (ABOG)
- Invited talks: "Dept" -> "Department"
- Director of Ultrasound: date from the February 2026 appointment
- Clinical Activities: add the IBD clinic
- PDF/docx exported via Microsoft Word on crane-desk

Co-Authored-By: Claude Opus 5.5 (1M context) <noreply@anthropic.com>
</commit_message>
<xml_diff>
--- a/Andrew_Rausch_CV.docx
+++ b/Andrew_Rausch_CV.docx
@@ -363,7 +363,7 @@
           <w:b w:val="0"/>
           <w:i w:val="0"/>
         </w:rPr>
-        <w:t>Board Certification, American Board of Obstetricians &amp; Gynecologists</w:t>
+        <w:t>Board Certification, American Board of Obstetrics and Gynecology (ABOG)</w:t>
       </w:r>
     </w:p>
     <w:p>
@@ -382,7 +382,7 @@
           <w:b w:val="0"/>
           <w:i w:val="0"/>
         </w:rPr>
-        <w:t>Subspecialty Board Certification, American Board of Obstetricians &amp; Gynecologists, Maternal-Fetal Medicine</w:t>
+        <w:t>Subspecialty Board Certification, American Board of Obstetrics and Gynecology (ABOG), Maternal-Fetal Medicine</w:t>
       </w:r>
     </w:p>
     <w:p>
@@ -629,7 +629,7 @@
           <w:b w:val="0"/>
           <w:i w:val="0"/>
         </w:rPr>
-        <w:t>Dept of Obstetrics &amp; Gynecology Grand Rounds. “Artificial Intelligence in Obstetrics” Stamford Hospital, Stamford, CT</w:t>
+        <w:t>Department of Obstetrics &amp; Gynecology Grand Rounds. “Artificial Intelligence in Obstetrics” Stamford Hospital, Stamford, CT</w:t>
       </w:r>
     </w:p>
     <w:p>
@@ -1246,7 +1246,7 @@
           <w:b w:val="0"/>
           <w:i w:val="0"/>
         </w:rPr>
-        <w:t>Director of Ultrasound, Department of Obstetrics &amp; Gynecology, University of Chicago. Assumed day-to-day operational leadership of the ultrasound unit in January 2026; formally appointed Director of Ultrasound in February 2026. The unit (Hyde Park, offsite locations, and affiliated FQHCs) achieved AIUM practice accreditation in September 2026, and scan volume has increased 10–12% year over year since the transition. Developed and implemented a written quality assurance program for the unit.</w:t>
+        <w:t>Director of Ultrasound, Department of Obstetrics &amp; Gynecology, University of Chicago. Appointed Director of Ultrasound in February 2026. The unit (Hyde Park, offsite locations, and affiliated FQHCs) achieved AIUM practice accreditation in September 2026, and scan volume has increased 10–12% year over year since that appointment. Developed and implemented a written quality assurance program for the unit.</w:t>
       </w:r>
     </w:p>
     <w:p>
@@ -1357,7 +1357,7 @@
           <w:b w:val="0"/>
           <w:i w:val="0"/>
         </w:rPr>
-        <w:t>Alternate Representative for the University of Chicago's membership in the North American Fetal Therapy Network (NAFTNet)</w:t>
+        <w:t>Alternate Representative for the University of Chicago's membership in the North American Fetal Therapy Network (NAFTNet), 2023–present</w:t>
       </w:r>
     </w:p>
     <w:p>
@@ -1383,6 +1383,25 @@
     </w:p>
     <w:p>
       <w:pPr>
+        <w:tabs>
+          <w:tab w:pos="1440" w:val="left"/>
+        </w:tabs>
+        <w:ind w:left="1440" w:hanging="1440"/>
+      </w:pPr>
+      <w:r>
+        <w:t>2025–present</w:t>
+        <w:tab/>
+      </w:r>
+      <w:r>
+        <w:rPr>
+          <w:b w:val="0"/>
+          <w:i w:val="0"/>
+        </w:rPr>
+        <w:t>MFM Lead, Pregnancy and Preconception in IBD clinic, University of Chicago. Multidisciplinary preconception and pregnancy care for patients with inflammatory bowel disease.</w:t>
+      </w:r>
+    </w:p>
+    <w:p>
+      <w:pPr>
         <w:keepNext/>
         <w:spacing w:before="240" w:after="0"/>
       </w:pPr>
@@ -1631,7 +1650,7 @@
           <w:b w:val="0"/>
           <w:i w:val="0"/>
         </w:rPr>
-        <w:t>Co-Principal Investigator, PF5 international collaboration grant, University of Chicago – Radboudumc (Radboud University Medical Center, Nijmegen, Netherlands); Heather Whitney, PhD, UChicago PI. Uncertainty quantification for AI on medical imaging, with multimodal ovarian cancer characterization (MRI, ultrasound, proteomics, EHR) for differentiation, prognosis, and diagnosis of recurrence. Submitted 2026; pending review.</w:t>
+        <w:t>Co-Principal Investigator, PF5 international collaboration grant, University of Chicago – Radboud University; Heather Whitney, PhD, UChicago PI. Uncertainty quantification for AI on medical imaging, with multimodal ovarian cancer characterization (MRI, ultrasound, proteomics, EHR) for differentiation, prognosis, and diagnosis of recurrence. Submitted September 2026; pending review.</w:t>
       </w:r>
     </w:p>
     <w:p>
@@ -2540,7 +2559,7 @@
           <w:b w:val="0"/>
           <w:i w:val="0"/>
         </w:rPr>
-        <w:t>Quantitative Ultrasound Biomarkers for Gynecologic and Obstetric Imaging Across the Reproductive Lifespan, Heather Whitney PhD PI – Andrew C Rausch, co-I, 0.1 FTE</w:t>
+        <w:t>PF5 international collaboration grant, University of Chicago – Radboud University: uncertainty quantification for AI on medical imaging in multimodal ovarian cancer characterization, Heather Whitney PhD UChicago PI – Andrew C Rausch, co-PI (submitted September 2026)</w:t>
       </w:r>
     </w:p>
     <w:p>

</xml_diff>

<commit_message>
CV: correct medical school name to Tufts University School of Medicine
The MD-granting school is Tufts University School of Medicine; "Sackler"
was the graduate biomedical sciences school and building name (removed by
Tufts in 2019). Fixes the CV source and resume.html, and rebuilds the
docx/PDF.

PDF exported via LibreOffice (Carlito standing in for Calibri) rather
than Word. Text diff against the previous Word PDF: only the Dated stamp
and the removed word; page breaks identical across all 6 pages.

Co-Authored-By: Claude Opus 5.5 <noreply@anthropic.com>
Claude-Session: https://claude.ai/code/session_01G5bNrXLxi8Zae5xAxtimmw
</commit_message>
<xml_diff>
--- a/Andrew_Rausch_CV.docx
+++ b/Andrew_Rausch_CV.docx
@@ -31,7 +31,7 @@
         <w:jc w:val="right"/>
       </w:pPr>
       <w:r>
-        <w:t>Chicago, 10/14/26</w:t>
+        <w:t>Chicago, 10/16/26</w:t>
       </w:r>
     </w:p>
     <w:p/>
@@ -256,7 +256,7 @@
           <w:b w:val="0"/>
           <w:i w:val="0"/>
         </w:rPr>
-        <w:t>MD, Tufts University Sackler School of Medicine, Boston, MA</w:t>
+        <w:t>MD, Tufts University School of Medicine, Boston, MA</w:t>
       </w:r>
     </w:p>
     <w:p>

</xml_diff>